<commit_message>
Replace interpreter resume download with supplied company template
</commit_message>
<xml_diff>
--- a/public/templates/onli-interpreter-resume.docx
+++ b/public/templates/onli-interpreter-resume.docx
@@ -1,6 +1,6 @@
 
 <file path=word/document.xml><?xml version="1.0" encoding="utf-8"?>
-<w:document xmlns:wpc="http://schemas.microsoft.com/office/word/2010/wordprocessingCanvas" xmlns:cx="http://schemas.microsoft.com/office/drawing/2014/chartex" xmlns:cx1="http://schemas.microsoft.com/office/drawing/2015/9/8/chartex" xmlns:cx2="http://schemas.microsoft.com/office/drawing/2015/10/21/chartex" xmlns:cx3="http://schemas.microsoft.com/office/drawing/2016/5/9/chartex" xmlns:cx4="http://schemas.microsoft.com/office/drawing/2016/5/10/chartex" xmlns:cx5="http://schemas.microsoft.com/office/drawing/2016/5/11/chartex" xmlns:cx6="http://schemas.microsoft.com/office/drawing/2016/5/12/chartex" xmlns:cx7="http://schemas.microsoft.com/office/drawing/2016/5/13/chartex" xmlns:cx8="http://schemas.microsoft.com/office/drawing/2016/5/14/chartex" xmlns:mc="http://schemas.openxmlformats.org/markup-compatibility/2006" xmlns:aink="http://schemas.microsoft.com/office/drawing/2016/ink" xmlns:am3d="http://schemas.microsoft.com/office/drawing/2017/model3d" xmlns:o="urn:schemas-microsoft-com:office:office" xmlns:oel="http://schemas.microsoft.com/office/2019/extlst" xmlns:r="http://schemas.openxmlformats.org/officeDocument/2006/relationships" xmlns:m="http://schemas.openxmlformats.org/officeDocument/2006/math" xmlns:v="urn:schemas-microsoft-com:vml" xmlns:wp14="http://schemas.microsoft.com/office/word/2010/wordprocessingDrawing" xmlns:wp="http://schemas.openxmlformats.org/drawingml/2006/wordprocessingDrawing" xmlns:w10="urn:schemas-microsoft-com:office:word" xmlns:w="http://schemas.openxmlformats.org/wordprocessingml/2006/main" xmlns:w14="http://schemas.microsoft.com/office/word/2010/wordml" xmlns:w15="http://schemas.microsoft.com/office/word/2012/wordml" xmlns:w16cex="http://schemas.microsoft.com/office/word/2018/wordml/cex" xmlns:w16cid="http://schemas.microsoft.com/office/word/2016/wordml/cid" xmlns:w16="http://schemas.microsoft.com/office/word/2018/wordml" xmlns:w16du="http://schemas.microsoft.com/office/word/2023/wordml/word16du" xmlns:w16sdtdh="http://schemas.microsoft.com/office/word/2020/wordml/sdtdatahash" xmlns:w16sdtfl="http://schemas.microsoft.com/office/word/2024/wordml/sdtformatlock" xmlns:w16se="http://schemas.microsoft.com/office/word/2015/wordml/symex" xmlns:wpg="http://schemas.microsoft.com/office/word/2010/wordprocessingGroup" xmlns:wpi="http://schemas.microsoft.com/office/word/2010/wordprocessingInk" xmlns:wne="http://schemas.microsoft.com/office/word/2006/wordml" xmlns:wps="http://schemas.microsoft.com/office/word/2010/wordprocessingShape" mc:Ignorable="w14 w15 w16se w16cid w16 w16cex w16sdtdh w16sdtfl w16du wp14">
+<w:document xmlns:wpc="http://schemas.microsoft.com/office/word/2010/wordprocessingCanvas" xmlns:cx="http://schemas.microsoft.com/office/drawing/2014/chartex" xmlns:cx1="http://schemas.microsoft.com/office/drawing/2015/9/8/chartex" xmlns:cx2="http://schemas.microsoft.com/office/drawing/2015/10/21/chartex" xmlns:cx3="http://schemas.microsoft.com/office/drawing/2016/5/9/chartex" xmlns:cx4="http://schemas.microsoft.com/office/drawing/2016/5/10/chartex" xmlns:cx5="http://schemas.microsoft.com/office/drawing/2016/5/11/chartex" xmlns:cx6="http://schemas.microsoft.com/office/drawing/2016/5/12/chartex" xmlns:cx7="http://schemas.microsoft.com/office/drawing/2016/5/13/chartex" xmlns:cx8="http://schemas.microsoft.com/office/drawing/2016/5/14/chartex" xmlns:mc="http://schemas.openxmlformats.org/markup-compatibility/2006" xmlns:m="http://schemas.openxmlformats.org/officeDocument/2006/math" xmlns:aink="http://schemas.microsoft.com/office/drawing/2016/ink" xmlns:am3d="http://schemas.microsoft.com/office/drawing/2017/model3d" xmlns:oel="http://schemas.microsoft.com/office/2019/extlst" xmlns:r="http://schemas.openxmlformats.org/officeDocument/2006/relationships" xmlns:wp14="http://schemas.microsoft.com/office/word/2010/wordprocessingDrawing" xmlns:wp="http://schemas.openxmlformats.org/drawingml/2006/wordprocessingDrawing" xmlns:wpg="http://schemas.microsoft.com/office/word/2010/wordprocessingGroup" xmlns:wpi="http://schemas.microsoft.com/office/word/2010/wordprocessingInk" xmlns:wps="http://schemas.microsoft.com/office/word/2010/wordprocessingShape" xmlns:o="urn:schemas-microsoft-com:office:office" xmlns:v="urn:schemas-microsoft-com:vml" xmlns:w10="urn:schemas-microsoft-com:office:word" xmlns:w="http://schemas.openxmlformats.org/wordprocessingml/2006/main" xmlns:w14="http://schemas.microsoft.com/office/word/2010/wordml" xmlns:w15="http://schemas.microsoft.com/office/word/2012/wordml" xmlns:w16cex="http://schemas.microsoft.com/office/word/2018/wordml/cex" xmlns:w16cid="http://schemas.microsoft.com/office/word/2016/wordml/cid" xmlns:w16="http://schemas.microsoft.com/office/word/2018/wordml" xmlns:w16sdtdh="http://schemas.microsoft.com/office/word/2020/wordml/sdtdatahash" xmlns:w16sdtfl="http://schemas.microsoft.com/office/word/2024/wordml/sdtformatlock" xmlns:w16se="http://schemas.microsoft.com/office/word/2015/wordml/symex" xmlns:w16du="http://schemas.microsoft.com/office/word/2023/wordml/word16du" xmlns:wne="http://schemas.microsoft.com/office/word/2006/wordml" mc:Ignorable="w14 w15 w16se w16cid w16 w16cex w16sdtdh w16sdtfl w16du wp14">
   <w:body>
     <w:tbl>
       <w:tblPr>
@@ -40,7 +40,7 @@
           <w:p>
             <w:pPr>
               <w:rPr>
-                <w:rFonts w:ascii="Batang" w:eastAsia="Batang" w:hAnsi="Batang" w:cs="Batang"/>
+                <w:rFonts w:ascii="바탕" w:eastAsia="바탕" w:hAnsi="바탕" w:cs="바탕"/>
                 <w:sz w:val="40"/>
                 <w:szCs w:val="40"/>
                 <w:lang w:eastAsia="ko-KR"/>
@@ -49,7 +49,7 @@
             <w:proofErr w:type="spellStart"/>
             <w:r>
               <w:rPr>
-                <w:rFonts w:ascii="Batang" w:eastAsia="Batang" w:hAnsi="Batang" w:cs="Batang" w:hint="eastAsia"/>
+                <w:rFonts w:ascii="바탕" w:eastAsia="바탕" w:hAnsi="바탕" w:cs="바탕" w:hint="eastAsia"/>
                 <w:color w:val="000000"/>
                 <w:sz w:val="40"/>
                 <w:szCs w:val="40"/>
@@ -60,7 +60,7 @@
             <w:proofErr w:type="spellEnd"/>
             <w:r>
               <w:rPr>
-                <w:rFonts w:ascii="Batang" w:eastAsia="Batang" w:hAnsi="Batang" w:hint="eastAsia"/>
+                <w:rFonts w:ascii="바탕" w:eastAsia="바탕" w:hAnsi="바탕" w:hint="eastAsia"/>
                 <w:color w:val="000000"/>
                 <w:sz w:val="40"/>
                 <w:szCs w:val="40"/>
@@ -69,7 +69,7 @@
             </w:r>
             <w:r>
               <w:rPr>
-                <w:rFonts w:ascii="Batang" w:eastAsia="Batang" w:hAnsi="Batang" w:cs="Batang" w:hint="eastAsia"/>
+                <w:rFonts w:ascii="바탕" w:eastAsia="바탕" w:hAnsi="바탕" w:cs="바탕" w:hint="eastAsia"/>
                 <w:color w:val="000000"/>
                 <w:sz w:val="40"/>
                 <w:szCs w:val="40"/>
@@ -79,7 +79,7 @@
             </w:r>
             <w:r>
               <w:rPr>
-                <w:rFonts w:ascii="Batang" w:eastAsia="Batang" w:hAnsi="Batang" w:hint="eastAsia"/>
+                <w:rFonts w:ascii="바탕" w:eastAsia="바탕" w:hAnsi="바탕" w:hint="eastAsia"/>
                 <w:color w:val="000000"/>
                 <w:sz w:val="40"/>
                 <w:szCs w:val="40"/>
@@ -88,7 +88,7 @@
             </w:r>
             <w:r>
               <w:rPr>
-                <w:rFonts w:ascii="Batang" w:eastAsia="Batang" w:hAnsi="Batang" w:cs="Batang" w:hint="eastAsia"/>
+                <w:rFonts w:ascii="바탕" w:eastAsia="바탕" w:hAnsi="바탕" w:cs="바탕" w:hint="eastAsia"/>
                 <w:color w:val="000000"/>
                 <w:sz w:val="40"/>
                 <w:szCs w:val="40"/>
@@ -114,15 +114,15 @@
             <w:pPr>
               <w:jc w:val="right"/>
               <w:rPr>
-                <w:rFonts w:ascii="Batang" w:eastAsia="Batang" w:hAnsi="Batang"/>
-                <w:sz w:val="22"/>
-                <w:szCs w:val="22"/>
-                <w:lang w:eastAsia="ko-KR"/>
-              </w:rPr>
-            </w:pPr>
-            <w:r>
-              <w:rPr>
-                <w:rFonts w:ascii="Batang" w:eastAsia="Batang" w:hAnsi="Batang" w:cs="MS PGothic"/>
+                <w:rFonts w:ascii="바탕" w:eastAsia="바탕" w:hAnsi="바탕"/>
+                <w:sz w:val="22"/>
+                <w:szCs w:val="22"/>
+                <w:lang w:eastAsia="ko-KR"/>
+              </w:rPr>
+            </w:pPr>
+            <w:r>
+              <w:rPr>
+                <w:rFonts w:ascii="바탕" w:eastAsia="바탕" w:hAnsi="바탕" w:cs="MS PGothic"/>
                 <w:noProof/>
                 <w:kern w:val="0"/>
                 <w:sz w:val="22"/>
@@ -270,7 +270,7 @@
             </w:r>
             <w:r>
               <w:rPr>
-                <w:rFonts w:ascii="Batang" w:eastAsia="Batang" w:hAnsi="Batang" w:hint="eastAsia"/>
+                <w:rFonts w:ascii="바탕" w:eastAsia="바탕" w:hAnsi="바탕" w:hint="eastAsia"/>
                 <w:color w:val="000000"/>
                 <w:sz w:val="22"/>
                 <w:szCs w:val="22"/>
@@ -280,7 +280,7 @@
             </w:r>
             <w:r>
               <w:rPr>
-                <w:rFonts w:ascii="Batang" w:eastAsia="Batang" w:hAnsi="Batang" w:cs="Lucida Grande" w:hint="eastAsia"/>
+                <w:rFonts w:ascii="바탕" w:eastAsia="바탕" w:hAnsi="바탕" w:cs="Lucida Grande" w:hint="eastAsia"/>
                 <w:color w:val="000000"/>
                 <w:sz w:val="22"/>
                 <w:szCs w:val="22"/>
@@ -289,7 +289,7 @@
             </w:r>
             <w:r>
               <w:rPr>
-                <w:rFonts w:ascii="Batang" w:eastAsia="Batang" w:hAnsi="Batang" w:cs="Lucida Grande" w:hint="eastAsia"/>
+                <w:rFonts w:ascii="바탕" w:eastAsia="바탕" w:hAnsi="바탕" w:cs="Lucida Grande" w:hint="eastAsia"/>
                 <w:color w:val="000000"/>
                 <w:sz w:val="22"/>
                 <w:szCs w:val="22"/>
@@ -299,7 +299,7 @@
             </w:r>
             <w:r>
               <w:rPr>
-                <w:rFonts w:ascii="Batang" w:eastAsia="Batang" w:hAnsi="Batang" w:hint="eastAsia"/>
+                <w:rFonts w:ascii="바탕" w:eastAsia="바탕" w:hAnsi="바탕" w:hint="eastAsia"/>
                 <w:color w:val="000000"/>
                 <w:sz w:val="22"/>
                 <w:szCs w:val="22"/>
@@ -309,7 +309,7 @@
             </w:r>
             <w:r>
               <w:rPr>
-                <w:rFonts w:ascii="Batang" w:eastAsia="Batang" w:hAnsi="Batang" w:cs="Lucida Grande" w:hint="eastAsia"/>
+                <w:rFonts w:ascii="바탕" w:eastAsia="바탕" w:hAnsi="바탕" w:cs="Lucida Grande" w:hint="eastAsia"/>
                 <w:color w:val="000000"/>
                 <w:sz w:val="22"/>
                 <w:szCs w:val="22"/>
@@ -318,7 +318,7 @@
             </w:r>
             <w:r>
               <w:rPr>
-                <w:rFonts w:ascii="Batang" w:eastAsia="Batang" w:hAnsi="Batang" w:hint="eastAsia"/>
+                <w:rFonts w:ascii="바탕" w:eastAsia="바탕" w:hAnsi="바탕" w:hint="eastAsia"/>
                 <w:color w:val="000000"/>
                 <w:sz w:val="22"/>
                 <w:szCs w:val="22"/>
@@ -328,7 +328,7 @@
             </w:r>
             <w:r>
               <w:rPr>
-                <w:rFonts w:ascii="Batang" w:eastAsia="Batang" w:hAnsi="Batang" w:hint="eastAsia"/>
+                <w:rFonts w:ascii="바탕" w:eastAsia="바탕" w:hAnsi="바탕" w:hint="eastAsia"/>
                 <w:color w:val="000000"/>
                 <w:sz w:val="22"/>
                 <w:szCs w:val="22"/>
@@ -358,14 +358,14 @@
           <w:p>
             <w:pPr>
               <w:rPr>
-                <w:rFonts w:ascii="Batang" w:eastAsia="Batang" w:hAnsi="Batang"/>
+                <w:rFonts w:ascii="바탕" w:eastAsia="바탕" w:hAnsi="바탕"/>
                 <w:sz w:val="18"/>
                 <w:szCs w:val="18"/>
               </w:rPr>
             </w:pPr>
             <w:r>
               <w:rPr>
-                <w:rFonts w:ascii="Batang" w:eastAsia="Batang" w:hAnsi="Batang" w:hint="eastAsia"/>
+                <w:rFonts w:ascii="바탕" w:eastAsia="바탕" w:hAnsi="바탕" w:hint="eastAsia"/>
                 <w:sz w:val="18"/>
                 <w:szCs w:val="18"/>
               </w:rPr>
@@ -387,7 +387,7 @@
           <w:p>
             <w:pPr>
               <w:rPr>
-                <w:rFonts w:ascii="Batang" w:eastAsia="Batang" w:hAnsi="Batang"/>
+                <w:rFonts w:ascii="바탕" w:eastAsia="바탕" w:hAnsi="바탕"/>
                 <w:szCs w:val="22"/>
                 <w:lang w:eastAsia="ko-KR"/>
               </w:rPr>
@@ -413,15 +413,15 @@
           <w:p>
             <w:pPr>
               <w:rPr>
-                <w:rFonts w:ascii="Batang" w:eastAsia="Batang" w:hAnsi="Batang" w:cs="Batang"/>
-                <w:sz w:val="22"/>
-                <w:szCs w:val="22"/>
-                <w:lang w:eastAsia="ko-KR"/>
-              </w:rPr>
-            </w:pPr>
-            <w:r>
-              <w:rPr>
-                <w:rFonts w:ascii="Batang" w:eastAsia="Batang" w:hAnsi="Batang" w:cs="맑은 고딕" w:hint="eastAsia"/>
+                <w:rFonts w:ascii="바탕" w:eastAsia="바탕" w:hAnsi="바탕" w:cs="바탕"/>
+                <w:sz w:val="22"/>
+                <w:szCs w:val="22"/>
+                <w:lang w:eastAsia="ko-KR"/>
+              </w:rPr>
+            </w:pPr>
+            <w:r>
+              <w:rPr>
+                <w:rFonts w:ascii="바탕" w:eastAsia="바탕" w:hAnsi="바탕" w:cs="맑은 고딕" w:hint="eastAsia"/>
                 <w:sz w:val="22"/>
                 <w:szCs w:val="22"/>
                 <w:lang w:eastAsia="ko-KR"/>
@@ -430,7 +430,7 @@
             </w:r>
             <w:r>
               <w:rPr>
-                <w:rFonts w:ascii="Batang" w:eastAsia="Batang" w:hAnsi="Batang" w:cs="Batang" w:hint="eastAsia"/>
+                <w:rFonts w:ascii="바탕" w:eastAsia="바탕" w:hAnsi="바탕" w:cs="바탕" w:hint="eastAsia"/>
                 <w:sz w:val="22"/>
                 <w:szCs w:val="22"/>
                 <w:lang w:eastAsia="ko-KR"/>
@@ -439,7 +439,7 @@
             </w:r>
             <w:r>
               <w:rPr>
-                <w:rFonts w:ascii="Batang" w:eastAsia="Batang" w:hAnsi="Batang" w:cs="맑은 고딕" w:hint="eastAsia"/>
+                <w:rFonts w:ascii="바탕" w:eastAsia="바탕" w:hAnsi="바탕" w:cs="맑은 고딕" w:hint="eastAsia"/>
                 <w:sz w:val="22"/>
                 <w:szCs w:val="22"/>
                 <w:lang w:eastAsia="ko-KR"/>
@@ -461,7 +461,7 @@
           <w:p>
             <w:pPr>
               <w:rPr>
-                <w:rFonts w:ascii="Batang" w:eastAsia="Batang" w:hAnsi="Batang" w:cs="Batang"/>
+                <w:rFonts w:ascii="바탕" w:eastAsia="바탕" w:hAnsi="바탕" w:cs="바탕"/>
                 <w:sz w:val="32"/>
                 <w:szCs w:val="22"/>
                 <w:lang w:eastAsia="ko-KR"/>
@@ -489,15 +489,15 @@
             <w:pPr>
               <w:jc w:val="right"/>
               <w:rPr>
-                <w:rFonts w:ascii="Batang" w:eastAsia="Batang" w:hAnsi="Batang"/>
-                <w:sz w:val="22"/>
-                <w:szCs w:val="22"/>
-                <w:lang w:eastAsia="ko-KR"/>
-              </w:rPr>
-            </w:pPr>
-            <w:r>
-              <w:rPr>
-                <w:rFonts w:ascii="Batang" w:eastAsia="Batang" w:hAnsi="Batang" w:hint="eastAsia"/>
+                <w:rFonts w:ascii="바탕" w:eastAsia="바탕" w:hAnsi="바탕"/>
+                <w:sz w:val="22"/>
+                <w:szCs w:val="22"/>
+                <w:lang w:eastAsia="ko-KR"/>
+              </w:rPr>
+            </w:pPr>
+            <w:r>
+              <w:rPr>
+                <w:rFonts w:ascii="바탕" w:eastAsia="바탕" w:hAnsi="바탕" w:hint="eastAsia"/>
                 <w:color w:val="000000"/>
                 <w:sz w:val="22"/>
                 <w:szCs w:val="22"/>
@@ -507,7 +507,7 @@
             </w:r>
             <w:r>
               <w:rPr>
-                <w:rFonts w:ascii="Batang" w:eastAsia="Batang" w:hAnsi="Batang" w:hint="eastAsia"/>
+                <w:rFonts w:ascii="바탕" w:eastAsia="바탕" w:hAnsi="바탕" w:hint="eastAsia"/>
                 <w:color w:val="000000"/>
                 <w:sz w:val="22"/>
                 <w:szCs w:val="22"/>
@@ -517,7 +517,7 @@
             </w:r>
             <w:r>
               <w:rPr>
-                <w:rFonts w:ascii="Batang" w:eastAsia="Batang" w:hAnsi="Batang" w:hint="eastAsia"/>
+                <w:rFonts w:ascii="바탕" w:eastAsia="바탕" w:hAnsi="바탕" w:hint="eastAsia"/>
                 <w:color w:val="000000"/>
                 <w:sz w:val="22"/>
                 <w:szCs w:val="22"/>
@@ -527,7 +527,7 @@
             </w:r>
             <w:r>
               <w:rPr>
-                <w:rFonts w:ascii="Batang" w:eastAsia="Batang" w:hAnsi="Batang" w:hint="eastAsia"/>
+                <w:rFonts w:ascii="바탕" w:eastAsia="바탕" w:hAnsi="바탕" w:hint="eastAsia"/>
                 <w:color w:val="000000"/>
                 <w:sz w:val="22"/>
                 <w:szCs w:val="22"/>
@@ -537,7 +537,7 @@
             </w:r>
             <w:r>
               <w:rPr>
-                <w:rFonts w:ascii="Batang" w:eastAsia="Batang" w:hAnsi="Batang" w:hint="eastAsia"/>
+                <w:rFonts w:ascii="바탕" w:eastAsia="바탕" w:hAnsi="바탕" w:hint="eastAsia"/>
                 <w:color w:val="000000"/>
                 <w:sz w:val="22"/>
                 <w:szCs w:val="22"/>
@@ -547,7 +547,7 @@
             </w:r>
             <w:r>
               <w:rPr>
-                <w:rFonts w:ascii="Batang" w:eastAsia="Batang" w:hAnsi="Batang" w:hint="eastAsia"/>
+                <w:rFonts w:ascii="바탕" w:eastAsia="바탕" w:hAnsi="바탕" w:hint="eastAsia"/>
                 <w:color w:val="000000"/>
                 <w:sz w:val="22"/>
                 <w:szCs w:val="22"/>
@@ -557,7 +557,7 @@
             </w:r>
             <w:r>
               <w:rPr>
-                <w:rFonts w:ascii="Batang" w:eastAsia="Batang" w:hAnsi="Batang" w:hint="eastAsia"/>
+                <w:rFonts w:ascii="바탕" w:eastAsia="바탕" w:hAnsi="바탕" w:hint="eastAsia"/>
                 <w:color w:val="000000"/>
                 <w:sz w:val="22"/>
                 <w:szCs w:val="22"/>
@@ -567,7 +567,7 @@
             </w:r>
             <w:r>
               <w:rPr>
-                <w:rFonts w:ascii="Batang" w:eastAsia="Batang" w:hAnsi="Batang" w:hint="eastAsia"/>
+                <w:rFonts w:ascii="바탕" w:eastAsia="바탕" w:hAnsi="바탕" w:hint="eastAsia"/>
                 <w:color w:val="000000"/>
                 <w:sz w:val="22"/>
                 <w:szCs w:val="22"/>
@@ -577,7 +577,7 @@
             </w:r>
             <w:r>
               <w:rPr>
-                <w:rFonts w:ascii="Batang" w:eastAsia="Batang" w:hAnsi="Batang" w:hint="eastAsia"/>
+                <w:rFonts w:ascii="바탕" w:eastAsia="바탕" w:hAnsi="바탕" w:hint="eastAsia"/>
                 <w:color w:val="000000"/>
                 <w:sz w:val="22"/>
                 <w:szCs w:val="22"/>
@@ -587,7 +587,7 @@
             </w:r>
             <w:r>
               <w:rPr>
-                <w:rFonts w:ascii="Batang" w:eastAsia="Batang" w:hAnsi="Batang" w:cs="맑은 고딕" w:hint="eastAsia"/>
+                <w:rFonts w:ascii="바탕" w:eastAsia="바탕" w:hAnsi="바탕" w:cs="맑은 고딕" w:hint="eastAsia"/>
                 <w:color w:val="000000"/>
                 <w:sz w:val="22"/>
                 <w:szCs w:val="22"/>
@@ -597,7 +597,7 @@
             </w:r>
             <w:r>
               <w:rPr>
-                <w:rFonts w:ascii="Batang" w:eastAsia="Batang" w:hAnsi="Batang" w:hint="eastAsia"/>
+                <w:rFonts w:ascii="바탕" w:eastAsia="바탕" w:hAnsi="바탕" w:hint="eastAsia"/>
                 <w:color w:val="000000"/>
                 <w:sz w:val="22"/>
                 <w:szCs w:val="22"/>
@@ -607,7 +607,7 @@
             </w:r>
             <w:r>
               <w:rPr>
-                <w:rFonts w:ascii="Batang" w:eastAsia="Batang" w:hAnsi="Batang" w:hint="eastAsia"/>
+                <w:rFonts w:ascii="바탕" w:eastAsia="바탕" w:hAnsi="바탕" w:hint="eastAsia"/>
                 <w:color w:val="000000"/>
                 <w:sz w:val="22"/>
                 <w:szCs w:val="22"/>
@@ -617,7 +617,7 @@
             </w:r>
             <w:r>
               <w:rPr>
-                <w:rFonts w:ascii="Batang" w:eastAsia="Batang" w:hAnsi="Batang" w:cs="맑은 고딕" w:hint="eastAsia"/>
+                <w:rFonts w:ascii="바탕" w:eastAsia="바탕" w:hAnsi="바탕" w:cs="맑은 고딕" w:hint="eastAsia"/>
                 <w:color w:val="000000"/>
                 <w:sz w:val="22"/>
                 <w:szCs w:val="22"/>
@@ -627,7 +627,7 @@
             </w:r>
             <w:r>
               <w:rPr>
-                <w:rFonts w:ascii="Batang" w:eastAsia="Batang" w:hAnsi="Batang" w:hint="eastAsia"/>
+                <w:rFonts w:ascii="바탕" w:eastAsia="바탕" w:hAnsi="바탕" w:hint="eastAsia"/>
                 <w:color w:val="000000"/>
                 <w:sz w:val="22"/>
                 <w:szCs w:val="22"/>
@@ -649,14 +649,14 @@
             <w:pPr>
               <w:jc w:val="center"/>
               <w:rPr>
-                <w:rFonts w:ascii="Batang" w:eastAsia="Batang" w:hAnsi="Batang"/>
+                <w:rFonts w:ascii="바탕" w:eastAsia="바탕" w:hAnsi="바탕"/>
                 <w:sz w:val="18"/>
                 <w:szCs w:val="18"/>
               </w:rPr>
             </w:pPr>
             <w:r>
               <w:rPr>
-                <w:rFonts w:ascii="Batang" w:eastAsia="Batang" w:hAnsi="Batang" w:cs="Lucida Grande" w:hint="eastAsia"/>
+                <w:rFonts w:ascii="바탕" w:eastAsia="바탕" w:hAnsi="바탕" w:cs="Lucida Grande" w:hint="eastAsia"/>
                 <w:color w:val="000000"/>
                 <w:sz w:val="18"/>
                 <w:szCs w:val="18"/>
@@ -666,7 +666,7 @@
             </w:r>
             <w:r>
               <w:rPr>
-                <w:rFonts w:ascii="Batang" w:eastAsia="Batang" w:hAnsi="Batang" w:cs="Lucida Grande" w:hint="eastAsia"/>
+                <w:rFonts w:ascii="바탕" w:eastAsia="바탕" w:hAnsi="바탕" w:cs="Lucida Grande" w:hint="eastAsia"/>
                 <w:color w:val="000000"/>
                 <w:sz w:val="18"/>
                 <w:szCs w:val="18"/>
@@ -675,7 +675,7 @@
             </w:r>
             <w:r>
               <w:rPr>
-                <w:rFonts w:ascii="Batang" w:eastAsia="Batang" w:hAnsi="Batang" w:cs="Lucida Grande" w:hint="eastAsia"/>
+                <w:rFonts w:ascii="바탕" w:eastAsia="바탕" w:hAnsi="바탕" w:cs="Lucida Grande" w:hint="eastAsia"/>
                 <w:color w:val="000000"/>
                 <w:sz w:val="18"/>
                 <w:szCs w:val="18"/>
@@ -704,19 +704,12 @@
           <w:p>
             <w:pPr>
               <w:rPr>
-                <w:rFonts w:ascii="Batang" w:eastAsia="Batang" w:hAnsi="Batang"/>
+                <w:rFonts w:ascii="바탕" w:eastAsia="바탕" w:hAnsi="바탕"/>
                 <w:sz w:val="18"/>
                 <w:szCs w:val="18"/>
-              </w:rPr>
-            </w:pPr>
-            <w:r>
-              <w:rPr>
-                <w:rFonts w:ascii="Batang" w:eastAsia="Batang" w:hAnsi="Batang" w:hint="eastAsia"/>
-                <w:sz w:val="18"/>
-                <w:szCs w:val="18"/>
-              </w:rPr>
-              <w:t>ふりがな</w:t>
-            </w:r>
+                <w:lang w:eastAsia="ko-KR"/>
+              </w:rPr>
+            </w:pPr>
           </w:p>
         </w:tc>
         <w:tc>
@@ -734,7 +727,7 @@
           <w:p>
             <w:pPr>
               <w:rPr>
-                <w:rFonts w:ascii="Batang" w:eastAsia="Batang" w:hAnsi="Batang"/>
+                <w:rFonts w:ascii="바탕" w:eastAsia="바탕" w:hAnsi="바탕"/>
                 <w:szCs w:val="22"/>
               </w:rPr>
             </w:pPr>
@@ -761,14 +754,14 @@
             <w:pPr>
               <w:jc w:val="left"/>
               <w:rPr>
-                <w:rFonts w:ascii="Batang" w:eastAsia="Batang" w:hAnsi="Batang"/>
-                <w:sz w:val="22"/>
-                <w:szCs w:val="22"/>
-              </w:rPr>
-            </w:pPr>
-            <w:r>
-              <w:rPr>
-                <w:rFonts w:ascii="Batang" w:eastAsia="Batang" w:hAnsi="Batang" w:hint="eastAsia"/>
+                <w:rFonts w:ascii="바탕" w:eastAsia="바탕" w:hAnsi="바탕"/>
+                <w:sz w:val="22"/>
+                <w:szCs w:val="22"/>
+              </w:rPr>
+            </w:pPr>
+            <w:r>
+              <w:rPr>
+                <w:rFonts w:ascii="바탕" w:eastAsia="바탕" w:hAnsi="바탕" w:hint="eastAsia"/>
                 <w:sz w:val="22"/>
                 <w:szCs w:val="22"/>
                 <w:lang w:eastAsia="ko-KR"/>
@@ -777,7 +770,7 @@
             </w:r>
             <w:r>
               <w:rPr>
-                <w:rFonts w:ascii="Batang" w:eastAsia="Batang" w:hAnsi="Batang" w:hint="eastAsia"/>
+                <w:rFonts w:ascii="바탕" w:eastAsia="바탕" w:hAnsi="바탕" w:hint="eastAsia"/>
                 <w:sz w:val="22"/>
                 <w:szCs w:val="22"/>
                 <w:lang w:eastAsia="ko-KR"/>
@@ -786,7 +779,7 @@
             </w:r>
             <w:r>
               <w:rPr>
-                <w:rFonts w:ascii="Batang" w:eastAsia="Batang" w:hAnsi="Batang" w:hint="eastAsia"/>
+                <w:rFonts w:ascii="바탕" w:eastAsia="바탕" w:hAnsi="바탕" w:hint="eastAsia"/>
                 <w:sz w:val="22"/>
                 <w:szCs w:val="22"/>
               </w:rPr>
@@ -811,7 +804,7 @@
             </w:r>
             <w:r>
               <w:rPr>
-                <w:rFonts w:ascii="Batang" w:eastAsia="Batang" w:hAnsi="Batang" w:hint="eastAsia"/>
+                <w:rFonts w:ascii="바탕" w:eastAsia="바탕" w:hAnsi="바탕" w:hint="eastAsia"/>
                 <w:sz w:val="22"/>
                 <w:szCs w:val="22"/>
               </w:rPr>
@@ -819,7 +812,7 @@
             </w:r>
             <w:r>
               <w:rPr>
-                <w:rFonts w:ascii="Batang" w:eastAsia="Batang" w:hAnsi="Batang" w:hint="eastAsia"/>
+                <w:rFonts w:ascii="바탕" w:eastAsia="바탕" w:hAnsi="바탕" w:hint="eastAsia"/>
                 <w:sz w:val="22"/>
                 <w:szCs w:val="22"/>
                 <w:lang w:eastAsia="ko-KR"/>
@@ -828,7 +821,7 @@
             </w:r>
             <w:r>
               <w:rPr>
-                <w:rFonts w:ascii="Batang" w:eastAsia="Batang" w:hAnsi="Batang" w:hint="eastAsia"/>
+                <w:rFonts w:ascii="바탕" w:eastAsia="바탕" w:hAnsi="바탕" w:hint="eastAsia"/>
                 <w:sz w:val="22"/>
                 <w:szCs w:val="22"/>
               </w:rPr>
@@ -857,7 +850,7 @@
             <w:pPr>
               <w:jc w:val="left"/>
               <w:rPr>
-                <w:rFonts w:ascii="Batang" w:eastAsia="Batang" w:hAnsi="Batang"/>
+                <w:rFonts w:ascii="바탕" w:eastAsia="바탕" w:hAnsi="바탕"/>
                 <w:sz w:val="32"/>
                 <w:szCs w:val="22"/>
               </w:rPr>
@@ -883,14 +876,14 @@
           <w:p>
             <w:pPr>
               <w:rPr>
-                <w:rFonts w:ascii="Batang" w:eastAsia="Batang" w:hAnsi="Batang"/>
-                <w:sz w:val="22"/>
-                <w:szCs w:val="22"/>
-              </w:rPr>
-            </w:pPr>
-            <w:r>
-              <w:rPr>
-                <w:rFonts w:ascii="Batang" w:eastAsia="Batang" w:hAnsi="Batang"/>
+                <w:rFonts w:ascii="바탕" w:eastAsia="바탕" w:hAnsi="바탕"/>
+                <w:sz w:val="22"/>
+                <w:szCs w:val="22"/>
+              </w:rPr>
+            </w:pPr>
+            <w:r>
+              <w:rPr>
+                <w:rFonts w:ascii="바탕" w:eastAsia="바탕" w:hAnsi="바탕"/>
                 <w:sz w:val="22"/>
                 <w:szCs w:val="22"/>
               </w:rPr>
@@ -913,7 +906,7 @@
           <w:p>
             <w:pPr>
               <w:rPr>
-                <w:rFonts w:ascii="Batang" w:eastAsia="Batang" w:hAnsi="Batang"/>
+                <w:rFonts w:ascii="바탕" w:eastAsia="바탕" w:hAnsi="바탕"/>
                 <w:szCs w:val="22"/>
               </w:rPr>
             </w:pPr>
@@ -934,15 +927,15 @@
             <w:pPr>
               <w:jc w:val="left"/>
               <w:rPr>
-                <w:rFonts w:ascii="Batang" w:eastAsia="Batang" w:hAnsi="Batang" w:cs="Batang"/>
-                <w:sz w:val="22"/>
-                <w:szCs w:val="22"/>
-                <w:lang w:eastAsia="ko-KR"/>
-              </w:rPr>
-            </w:pPr>
-            <w:r>
-              <w:rPr>
-                <w:rFonts w:ascii="Batang" w:eastAsia="Batang" w:hAnsi="Batang" w:cs="맑은 고딕" w:hint="eastAsia"/>
+                <w:rFonts w:ascii="바탕" w:eastAsia="바탕" w:hAnsi="바탕" w:cs="바탕"/>
+                <w:sz w:val="22"/>
+                <w:szCs w:val="22"/>
+                <w:lang w:eastAsia="ko-KR"/>
+              </w:rPr>
+            </w:pPr>
+            <w:r>
+              <w:rPr>
+                <w:rFonts w:ascii="바탕" w:eastAsia="바탕" w:hAnsi="바탕" w:cs="맑은 고딕" w:hint="eastAsia"/>
                 <w:sz w:val="22"/>
                 <w:szCs w:val="22"/>
                 <w:lang w:eastAsia="ko-KR"/>
@@ -965,7 +958,7 @@
           <w:p>
             <w:pPr>
               <w:rPr>
-                <w:rFonts w:ascii="Batang" w:eastAsia="Batang" w:hAnsi="Batang"/>
+                <w:rFonts w:ascii="바탕" w:eastAsia="바탕" w:hAnsi="바탕"/>
                 <w:szCs w:val="22"/>
                 <w:lang w:eastAsia="ko-KR"/>
               </w:rPr>
@@ -1085,7 +1078,7 @@
             </w:r>
             <w:r>
               <w:rPr>
-                <w:rFonts w:ascii="MS Mincho" w:eastAsia="MS Mincho" w:hAnsi="MS Mincho" w:cs="Batang" w:hint="eastAsia"/>
+                <w:rFonts w:ascii="MS Mincho" w:eastAsia="MS Mincho" w:hAnsi="MS Mincho" w:cs="바탕" w:hint="eastAsia"/>
                 <w:color w:val="000000"/>
                 <w:sz w:val="22"/>
                 <w:szCs w:val="22"/>
@@ -1132,7 +1125,7 @@
             </w:r>
             <w:r>
               <w:rPr>
-                <w:rFonts w:ascii="MS Mincho" w:eastAsia="MS Mincho" w:hAnsi="MS Mincho" w:cs="Batang" w:hint="eastAsia"/>
+                <w:rFonts w:ascii="MS Mincho" w:eastAsia="MS Mincho" w:hAnsi="MS Mincho" w:cs="바탕" w:hint="eastAsia"/>
                 <w:color w:val="000000"/>
                 <w:sz w:val="22"/>
                 <w:szCs w:val="22"/>
@@ -1171,7 +1164,7 @@
               <w:spacing w:line="240" w:lineRule="atLeast"/>
               <w:jc w:val="center"/>
               <w:rPr>
-                <w:rFonts w:ascii="Batang" w:eastAsia="Batang" w:hAnsi="Batang"/>
+                <w:rFonts w:ascii="바탕" w:eastAsia="바탕" w:hAnsi="바탕"/>
                 <w:szCs w:val="22"/>
               </w:rPr>
             </w:pPr>
@@ -1191,7 +1184,7 @@
               <w:spacing w:line="240" w:lineRule="atLeast"/>
               <w:jc w:val="center"/>
               <w:rPr>
-                <w:rFonts w:ascii="Batang" w:eastAsia="Batang" w:hAnsi="Batang"/>
+                <w:rFonts w:ascii="바탕" w:eastAsia="바탕" w:hAnsi="바탕"/>
                 <w:szCs w:val="22"/>
               </w:rPr>
             </w:pPr>
@@ -1210,14 +1203,14 @@
             <w:pPr>
               <w:spacing w:line="240" w:lineRule="atLeast"/>
               <w:rPr>
-                <w:rFonts w:ascii="Batang" w:eastAsia="Batang" w:hAnsi="Batang" w:cs="Batang"/>
-                <w:szCs w:val="22"/>
-                <w:lang w:eastAsia="ko-KR"/>
-              </w:rPr>
-            </w:pPr>
-            <w:r>
-              <w:rPr>
-                <w:rFonts w:ascii="Batang" w:eastAsia="Batang" w:hAnsi="Batang" w:cs="맑은 고딕" w:hint="eastAsia"/>
+                <w:rFonts w:ascii="바탕" w:eastAsia="바탕" w:hAnsi="바탕" w:cs="바탕"/>
+                <w:szCs w:val="22"/>
+                <w:lang w:eastAsia="ko-KR"/>
+              </w:rPr>
+            </w:pPr>
+            <w:r>
+              <w:rPr>
+                <w:rFonts w:ascii="바탕" w:eastAsia="바탕" w:hAnsi="바탕" w:cs="맑은 고딕" w:hint="eastAsia"/>
                 <w:szCs w:val="22"/>
                 <w:lang w:eastAsia="ko-KR"/>
               </w:rPr>
@@ -1246,7 +1239,7 @@
               <w:spacing w:line="240" w:lineRule="atLeast"/>
               <w:jc w:val="center"/>
               <w:rPr>
-                <w:rFonts w:ascii="Batang" w:eastAsia="Batang" w:hAnsi="Batang"/>
+                <w:rFonts w:ascii="바탕" w:eastAsia="바탕" w:hAnsi="바탕"/>
                 <w:szCs w:val="22"/>
               </w:rPr>
             </w:pPr>
@@ -1267,7 +1260,7 @@
               <w:spacing w:line="240" w:lineRule="atLeast"/>
               <w:jc w:val="center"/>
               <w:rPr>
-                <w:rFonts w:ascii="Batang" w:eastAsia="Batang" w:hAnsi="Batang"/>
+                <w:rFonts w:ascii="바탕" w:eastAsia="바탕" w:hAnsi="바탕"/>
                 <w:szCs w:val="22"/>
               </w:rPr>
             </w:pPr>
@@ -1287,7 +1280,7 @@
             <w:pPr>
               <w:spacing w:line="240" w:lineRule="atLeast"/>
               <w:rPr>
-                <w:rFonts w:ascii="Batang" w:eastAsia="Batang" w:hAnsi="Batang" w:cs="Batang"/>
+                <w:rFonts w:ascii="바탕" w:eastAsia="바탕" w:hAnsi="바탕" w:cs="바탕"/>
                 <w:szCs w:val="22"/>
                 <w:lang w:eastAsia="ko-KR"/>
               </w:rPr>
@@ -1315,7 +1308,7 @@
               <w:spacing w:line="240" w:lineRule="atLeast"/>
               <w:jc w:val="center"/>
               <w:rPr>
-                <w:rFonts w:ascii="Batang" w:eastAsia="Batang" w:hAnsi="Batang"/>
+                <w:rFonts w:ascii="바탕" w:eastAsia="바탕" w:hAnsi="바탕"/>
                 <w:szCs w:val="22"/>
               </w:rPr>
             </w:pPr>
@@ -1336,7 +1329,7 @@
               <w:spacing w:line="240" w:lineRule="atLeast"/>
               <w:jc w:val="center"/>
               <w:rPr>
-                <w:rFonts w:ascii="Batang" w:eastAsia="Batang" w:hAnsi="Batang"/>
+                <w:rFonts w:ascii="바탕" w:eastAsia="바탕" w:hAnsi="바탕"/>
                 <w:szCs w:val="22"/>
               </w:rPr>
             </w:pPr>
@@ -1356,7 +1349,7 @@
             <w:pPr>
               <w:spacing w:line="240" w:lineRule="atLeast"/>
               <w:rPr>
-                <w:rFonts w:ascii="Batang" w:eastAsia="Batang" w:hAnsi="Batang" w:cs="Batang"/>
+                <w:rFonts w:ascii="바탕" w:eastAsia="바탕" w:hAnsi="바탕" w:cs="바탕"/>
                 <w:szCs w:val="22"/>
                 <w:lang w:eastAsia="ko-KR"/>
               </w:rPr>
@@ -1384,7 +1377,7 @@
               <w:spacing w:line="240" w:lineRule="atLeast"/>
               <w:jc w:val="center"/>
               <w:rPr>
-                <w:rFonts w:ascii="Batang" w:eastAsia="Batang" w:hAnsi="Batang"/>
+                <w:rFonts w:ascii="바탕" w:eastAsia="바탕" w:hAnsi="바탕"/>
                 <w:szCs w:val="22"/>
                 <w:lang w:eastAsia="ko-KR"/>
               </w:rPr>
@@ -1406,7 +1399,7 @@
               <w:spacing w:line="240" w:lineRule="atLeast"/>
               <w:jc w:val="center"/>
               <w:rPr>
-                <w:rFonts w:ascii="Batang" w:eastAsia="Batang" w:hAnsi="Batang"/>
+                <w:rFonts w:ascii="바탕" w:eastAsia="바탕" w:hAnsi="바탕"/>
                 <w:szCs w:val="22"/>
                 <w:lang w:eastAsia="ko-KR"/>
               </w:rPr>
@@ -1427,14 +1420,14 @@
             <w:pPr>
               <w:spacing w:line="240" w:lineRule="atLeast"/>
               <w:rPr>
-                <w:rFonts w:ascii="Batang" w:eastAsia="Batang" w:hAnsi="Batang" w:cs="Batang"/>
-                <w:szCs w:val="22"/>
-                <w:lang w:eastAsia="ko-KR"/>
-              </w:rPr>
-            </w:pPr>
-            <w:r>
-              <w:rPr>
-                <w:rFonts w:ascii="Batang" w:eastAsia="Batang" w:hAnsi="Batang" w:cs="맑은 고딕" w:hint="eastAsia"/>
+                <w:rFonts w:ascii="바탕" w:eastAsia="바탕" w:hAnsi="바탕" w:cs="바탕"/>
+                <w:szCs w:val="22"/>
+                <w:lang w:eastAsia="ko-KR"/>
+              </w:rPr>
+            </w:pPr>
+            <w:r>
+              <w:rPr>
+                <w:rFonts w:ascii="바탕" w:eastAsia="바탕" w:hAnsi="바탕" w:cs="맑은 고딕" w:hint="eastAsia"/>
                 <w:szCs w:val="22"/>
                 <w:lang w:eastAsia="ko-KR"/>
               </w:rPr>
@@ -1463,7 +1456,7 @@
               <w:spacing w:line="240" w:lineRule="atLeast"/>
               <w:jc w:val="center"/>
               <w:rPr>
-                <w:rFonts w:ascii="Batang" w:eastAsia="Batang" w:hAnsi="Batang"/>
+                <w:rFonts w:ascii="바탕" w:eastAsia="바탕" w:hAnsi="바탕"/>
                 <w:szCs w:val="22"/>
               </w:rPr>
             </w:pPr>
@@ -1484,7 +1477,7 @@
               <w:spacing w:line="240" w:lineRule="atLeast"/>
               <w:jc w:val="center"/>
               <w:rPr>
-                <w:rFonts w:ascii="Batang" w:eastAsia="Batang" w:hAnsi="Batang"/>
+                <w:rFonts w:ascii="바탕" w:eastAsia="바탕" w:hAnsi="바탕"/>
                 <w:szCs w:val="22"/>
               </w:rPr>
             </w:pPr>
@@ -1504,7 +1497,7 @@
             <w:pPr>
               <w:spacing w:line="240" w:lineRule="atLeast"/>
               <w:rPr>
-                <w:rFonts w:ascii="Batang" w:eastAsia="Batang" w:hAnsi="Batang" w:cs="Batang"/>
+                <w:rFonts w:ascii="바탕" w:eastAsia="바탕" w:hAnsi="바탕" w:cs="바탕"/>
                 <w:szCs w:val="22"/>
                 <w:lang w:eastAsia="ko-KR"/>
               </w:rPr>
@@ -1532,7 +1525,7 @@
               <w:spacing w:line="240" w:lineRule="atLeast"/>
               <w:jc w:val="center"/>
               <w:rPr>
-                <w:rFonts w:ascii="Batang" w:eastAsia="Batang" w:hAnsi="Batang"/>
+                <w:rFonts w:ascii="바탕" w:eastAsia="바탕" w:hAnsi="바탕"/>
                 <w:szCs w:val="22"/>
               </w:rPr>
             </w:pPr>
@@ -1553,7 +1546,7 @@
               <w:spacing w:line="240" w:lineRule="atLeast"/>
               <w:jc w:val="center"/>
               <w:rPr>
-                <w:rFonts w:ascii="Batang" w:eastAsia="Batang" w:hAnsi="Batang"/>
+                <w:rFonts w:ascii="바탕" w:eastAsia="바탕" w:hAnsi="바탕"/>
                 <w:szCs w:val="22"/>
               </w:rPr>
             </w:pPr>
@@ -1573,7 +1566,7 @@
             <w:pPr>
               <w:spacing w:line="240" w:lineRule="atLeast"/>
               <w:rPr>
-                <w:rFonts w:ascii="Batang" w:eastAsia="Batang" w:hAnsi="Batang" w:cs="Batang"/>
+                <w:rFonts w:ascii="바탕" w:eastAsia="바탕" w:hAnsi="바탕" w:cs="바탕"/>
                 <w:szCs w:val="22"/>
                 <w:lang w:eastAsia="ko-KR"/>
               </w:rPr>
@@ -1601,7 +1594,7 @@
               <w:spacing w:line="240" w:lineRule="atLeast"/>
               <w:jc w:val="center"/>
               <w:rPr>
-                <w:rFonts w:ascii="Batang" w:eastAsia="Batang" w:hAnsi="Batang"/>
+                <w:rFonts w:ascii="바탕" w:eastAsia="바탕" w:hAnsi="바탕"/>
                 <w:szCs w:val="22"/>
               </w:rPr>
             </w:pPr>
@@ -1622,7 +1615,7 @@
               <w:spacing w:line="240" w:lineRule="atLeast"/>
               <w:jc w:val="center"/>
               <w:rPr>
-                <w:rFonts w:ascii="Batang" w:eastAsia="Batang" w:hAnsi="Batang"/>
+                <w:rFonts w:ascii="바탕" w:eastAsia="바탕" w:hAnsi="바탕"/>
                 <w:szCs w:val="22"/>
               </w:rPr>
             </w:pPr>
@@ -1642,7 +1635,7 @@
             <w:pPr>
               <w:spacing w:line="240" w:lineRule="atLeast"/>
               <w:rPr>
-                <w:rFonts w:ascii="Batang" w:eastAsia="Batang" w:hAnsi="Batang" w:cs="Batang"/>
+                <w:rFonts w:ascii="바탕" w:eastAsia="바탕" w:hAnsi="바탕" w:cs="바탕"/>
                 <w:szCs w:val="22"/>
                 <w:lang w:eastAsia="ko-KR"/>
               </w:rPr>
@@ -1670,7 +1663,7 @@
               <w:spacing w:line="240" w:lineRule="atLeast"/>
               <w:jc w:val="center"/>
               <w:rPr>
-                <w:rFonts w:ascii="Batang" w:eastAsia="Batang" w:hAnsi="Batang"/>
+                <w:rFonts w:ascii="바탕" w:eastAsia="바탕" w:hAnsi="바탕"/>
                 <w:szCs w:val="22"/>
               </w:rPr>
             </w:pPr>
@@ -1691,7 +1684,7 @@
               <w:spacing w:line="240" w:lineRule="atLeast"/>
               <w:jc w:val="center"/>
               <w:rPr>
-                <w:rFonts w:ascii="Batang" w:eastAsia="Batang" w:hAnsi="Batang"/>
+                <w:rFonts w:ascii="바탕" w:eastAsia="바탕" w:hAnsi="바탕"/>
                 <w:szCs w:val="22"/>
               </w:rPr>
             </w:pPr>
@@ -1711,7 +1704,7 @@
             <w:pPr>
               <w:spacing w:line="240" w:lineRule="atLeast"/>
               <w:rPr>
-                <w:rFonts w:ascii="Batang" w:eastAsia="Batang" w:hAnsi="Batang" w:cs="Batang"/>
+                <w:rFonts w:ascii="바탕" w:eastAsia="바탕" w:hAnsi="바탕" w:cs="바탕"/>
                 <w:szCs w:val="22"/>
                 <w:lang w:eastAsia="ko-KR"/>
               </w:rPr>
@@ -1739,7 +1732,7 @@
               <w:spacing w:line="240" w:lineRule="atLeast"/>
               <w:jc w:val="center"/>
               <w:rPr>
-                <w:rFonts w:ascii="Batang" w:eastAsia="Batang" w:hAnsi="Batang"/>
+                <w:rFonts w:ascii="바탕" w:eastAsia="바탕" w:hAnsi="바탕"/>
                 <w:szCs w:val="22"/>
               </w:rPr>
             </w:pPr>
@@ -1760,7 +1753,7 @@
               <w:spacing w:line="240" w:lineRule="atLeast"/>
               <w:jc w:val="center"/>
               <w:rPr>
-                <w:rFonts w:ascii="Batang" w:eastAsia="Batang" w:hAnsi="Batang"/>
+                <w:rFonts w:ascii="바탕" w:eastAsia="바탕" w:hAnsi="바탕"/>
                 <w:szCs w:val="22"/>
               </w:rPr>
             </w:pPr>
@@ -1780,7 +1773,7 @@
             <w:pPr>
               <w:spacing w:line="240" w:lineRule="atLeast"/>
               <w:rPr>
-                <w:rFonts w:ascii="Batang" w:eastAsia="Batang" w:hAnsi="Batang" w:cs="Batang"/>
+                <w:rFonts w:ascii="바탕" w:eastAsia="바탕" w:hAnsi="바탕" w:cs="바탕"/>
                 <w:szCs w:val="22"/>
                 <w:lang w:eastAsia="ko-KR"/>
               </w:rPr>
@@ -1808,7 +1801,7 @@
               <w:spacing w:line="240" w:lineRule="atLeast"/>
               <w:jc w:val="center"/>
               <w:rPr>
-                <w:rFonts w:ascii="Batang" w:eastAsia="Batang" w:hAnsi="Batang"/>
+                <w:rFonts w:ascii="바탕" w:eastAsia="바탕" w:hAnsi="바탕"/>
                 <w:szCs w:val="22"/>
               </w:rPr>
             </w:pPr>
@@ -1829,7 +1822,7 @@
               <w:spacing w:line="240" w:lineRule="atLeast"/>
               <w:jc w:val="center"/>
               <w:rPr>
-                <w:rFonts w:ascii="Batang" w:eastAsia="Batang" w:hAnsi="Batang"/>
+                <w:rFonts w:ascii="바탕" w:eastAsia="바탕" w:hAnsi="바탕"/>
                 <w:szCs w:val="22"/>
               </w:rPr>
             </w:pPr>
@@ -1849,7 +1842,7 @@
             <w:pPr>
               <w:spacing w:line="240" w:lineRule="atLeast"/>
               <w:rPr>
-                <w:rFonts w:ascii="Batang" w:eastAsia="Batang" w:hAnsi="Batang" w:cs="Batang"/>
+                <w:rFonts w:ascii="바탕" w:eastAsia="바탕" w:hAnsi="바탕" w:cs="바탕"/>
                 <w:szCs w:val="22"/>
                 <w:lang w:eastAsia="ko-KR"/>
               </w:rPr>
@@ -1877,7 +1870,7 @@
               <w:spacing w:line="240" w:lineRule="atLeast"/>
               <w:jc w:val="center"/>
               <w:rPr>
-                <w:rFonts w:ascii="Batang" w:eastAsia="Batang" w:hAnsi="Batang"/>
+                <w:rFonts w:ascii="바탕" w:eastAsia="바탕" w:hAnsi="바탕"/>
                 <w:szCs w:val="22"/>
               </w:rPr>
             </w:pPr>
@@ -1898,7 +1891,7 @@
               <w:spacing w:line="240" w:lineRule="atLeast"/>
               <w:jc w:val="center"/>
               <w:rPr>
-                <w:rFonts w:ascii="Batang" w:eastAsia="Batang" w:hAnsi="Batang"/>
+                <w:rFonts w:ascii="바탕" w:eastAsia="바탕" w:hAnsi="바탕"/>
                 <w:szCs w:val="22"/>
               </w:rPr>
             </w:pPr>
@@ -1918,7 +1911,7 @@
             <w:pPr>
               <w:spacing w:line="240" w:lineRule="atLeast"/>
               <w:rPr>
-                <w:rFonts w:ascii="Batang" w:eastAsia="Batang" w:hAnsi="Batang" w:cs="Batang"/>
+                <w:rFonts w:ascii="바탕" w:eastAsia="바탕" w:hAnsi="바탕" w:cs="바탕"/>
                 <w:szCs w:val="22"/>
                 <w:lang w:eastAsia="ko-KR"/>
               </w:rPr>
@@ -1946,7 +1939,7 @@
               <w:spacing w:line="240" w:lineRule="atLeast"/>
               <w:jc w:val="center"/>
               <w:rPr>
-                <w:rFonts w:ascii="Batang" w:eastAsia="Batang" w:hAnsi="Batang"/>
+                <w:rFonts w:ascii="바탕" w:eastAsia="바탕" w:hAnsi="바탕"/>
                 <w:szCs w:val="22"/>
               </w:rPr>
             </w:pPr>
@@ -1967,7 +1960,7 @@
               <w:spacing w:line="240" w:lineRule="atLeast"/>
               <w:jc w:val="center"/>
               <w:rPr>
-                <w:rFonts w:ascii="Batang" w:eastAsia="Batang" w:hAnsi="Batang"/>
+                <w:rFonts w:ascii="바탕" w:eastAsia="바탕" w:hAnsi="바탕"/>
                 <w:szCs w:val="22"/>
               </w:rPr>
             </w:pPr>
@@ -1987,7 +1980,7 @@
             <w:pPr>
               <w:spacing w:line="240" w:lineRule="atLeast"/>
               <w:rPr>
-                <w:rFonts w:ascii="Batang" w:eastAsia="Batang" w:hAnsi="Batang" w:cs="Batang"/>
+                <w:rFonts w:ascii="바탕" w:eastAsia="바탕" w:hAnsi="바탕" w:cs="바탕"/>
                 <w:szCs w:val="22"/>
                 <w:lang w:eastAsia="ko-KR"/>
               </w:rPr>
@@ -2015,7 +2008,7 @@
               <w:spacing w:line="240" w:lineRule="atLeast"/>
               <w:jc w:val="center"/>
               <w:rPr>
-                <w:rFonts w:ascii="Batang" w:eastAsia="Batang" w:hAnsi="Batang"/>
+                <w:rFonts w:ascii="바탕" w:eastAsia="바탕" w:hAnsi="바탕"/>
                 <w:szCs w:val="22"/>
               </w:rPr>
             </w:pPr>
@@ -2036,7 +2029,7 @@
               <w:spacing w:line="240" w:lineRule="atLeast"/>
               <w:jc w:val="center"/>
               <w:rPr>
-                <w:rFonts w:ascii="Batang" w:eastAsia="Batang" w:hAnsi="Batang"/>
+                <w:rFonts w:ascii="바탕" w:eastAsia="바탕" w:hAnsi="바탕"/>
                 <w:szCs w:val="22"/>
               </w:rPr>
             </w:pPr>
@@ -2056,7 +2049,7 @@
             <w:pPr>
               <w:spacing w:line="240" w:lineRule="atLeast"/>
               <w:rPr>
-                <w:rFonts w:ascii="Batang" w:eastAsia="Batang" w:hAnsi="Batang" w:cs="Batang"/>
+                <w:rFonts w:ascii="바탕" w:eastAsia="바탕" w:hAnsi="바탕" w:cs="바탕"/>
                 <w:szCs w:val="22"/>
                 <w:lang w:eastAsia="ko-KR"/>
               </w:rPr>
@@ -2084,7 +2077,7 @@
               <w:spacing w:line="240" w:lineRule="atLeast"/>
               <w:jc w:val="center"/>
               <w:rPr>
-                <w:rFonts w:ascii="Batang" w:eastAsia="Batang" w:hAnsi="Batang"/>
+                <w:rFonts w:ascii="바탕" w:eastAsia="바탕" w:hAnsi="바탕"/>
                 <w:szCs w:val="22"/>
                 <w:lang w:eastAsia="ko-KR"/>
               </w:rPr>
@@ -2106,7 +2099,7 @@
               <w:spacing w:line="240" w:lineRule="atLeast"/>
               <w:jc w:val="center"/>
               <w:rPr>
-                <w:rFonts w:ascii="Batang" w:eastAsia="Batang" w:hAnsi="Batang"/>
+                <w:rFonts w:ascii="바탕" w:eastAsia="바탕" w:hAnsi="바탕"/>
                 <w:szCs w:val="22"/>
               </w:rPr>
             </w:pPr>
@@ -2154,7 +2147,7 @@
               <w:spacing w:line="240" w:lineRule="atLeast"/>
               <w:jc w:val="center"/>
               <w:rPr>
-                <w:rFonts w:ascii="Batang" w:eastAsia="Batang" w:hAnsi="Batang"/>
+                <w:rFonts w:ascii="바탕" w:eastAsia="바탕" w:hAnsi="바탕"/>
                 <w:szCs w:val="22"/>
                 <w:lang w:eastAsia="ko-KR"/>
               </w:rPr>
@@ -2176,7 +2169,7 @@
               <w:spacing w:line="240" w:lineRule="atLeast"/>
               <w:jc w:val="center"/>
               <w:rPr>
-                <w:rFonts w:ascii="Batang" w:eastAsia="Batang" w:hAnsi="Batang"/>
+                <w:rFonts w:ascii="바탕" w:eastAsia="바탕" w:hAnsi="바탕"/>
                 <w:szCs w:val="22"/>
               </w:rPr>
             </w:pPr>
@@ -2196,7 +2189,7 @@
             <w:pPr>
               <w:spacing w:line="240" w:lineRule="atLeast"/>
               <w:rPr>
-                <w:rFonts w:ascii="Batang" w:eastAsia="Batang" w:hAnsi="Batang" w:cs="맑은 고딕"/>
+                <w:rFonts w:ascii="바탕" w:eastAsia="바탕" w:hAnsi="바탕" w:cs="맑은 고딕"/>
                 <w:szCs w:val="22"/>
                 <w:lang w:eastAsia="ko-KR"/>
               </w:rPr>
@@ -2224,7 +2217,7 @@
               <w:spacing w:line="240" w:lineRule="atLeast"/>
               <w:jc w:val="center"/>
               <w:rPr>
-                <w:rFonts w:ascii="Batang" w:eastAsia="Batang" w:hAnsi="Batang"/>
+                <w:rFonts w:ascii="바탕" w:eastAsia="바탕" w:hAnsi="바탕"/>
                 <w:szCs w:val="22"/>
                 <w:lang w:eastAsia="ko-KR"/>
               </w:rPr>
@@ -2246,7 +2239,7 @@
               <w:spacing w:line="240" w:lineRule="atLeast"/>
               <w:jc w:val="center"/>
               <w:rPr>
-                <w:rFonts w:ascii="Batang" w:eastAsia="Batang" w:hAnsi="Batang"/>
+                <w:rFonts w:ascii="바탕" w:eastAsia="바탕" w:hAnsi="바탕"/>
                 <w:szCs w:val="22"/>
               </w:rPr>
             </w:pPr>
@@ -2266,7 +2259,7 @@
             <w:pPr>
               <w:spacing w:line="240" w:lineRule="atLeast"/>
               <w:rPr>
-                <w:rFonts w:ascii="Batang" w:eastAsia="Batang" w:hAnsi="Batang" w:cs="맑은 고딕"/>
+                <w:rFonts w:ascii="바탕" w:eastAsia="바탕" w:hAnsi="바탕" w:cs="맑은 고딕"/>
                 <w:szCs w:val="22"/>
                 <w:lang w:eastAsia="ko-KR"/>
               </w:rPr>
@@ -2294,7 +2287,7 @@
               <w:spacing w:line="240" w:lineRule="atLeast"/>
               <w:jc w:val="center"/>
               <w:rPr>
-                <w:rFonts w:ascii="Batang" w:eastAsia="Batang" w:hAnsi="Batang"/>
+                <w:rFonts w:ascii="바탕" w:eastAsia="바탕" w:hAnsi="바탕"/>
                 <w:szCs w:val="22"/>
                 <w:lang w:eastAsia="ko-KR"/>
               </w:rPr>
@@ -2316,7 +2309,7 @@
               <w:spacing w:line="240" w:lineRule="atLeast"/>
               <w:jc w:val="center"/>
               <w:rPr>
-                <w:rFonts w:ascii="Batang" w:eastAsia="Batang" w:hAnsi="Batang"/>
+                <w:rFonts w:ascii="바탕" w:eastAsia="바탕" w:hAnsi="바탕"/>
                 <w:szCs w:val="22"/>
                 <w:lang w:eastAsia="ko-KR"/>
               </w:rPr>
@@ -2337,7 +2330,7 @@
             <w:pPr>
               <w:spacing w:line="240" w:lineRule="atLeast"/>
               <w:rPr>
-                <w:rFonts w:ascii="Batang" w:eastAsia="Batang" w:hAnsi="Batang" w:cs="맑은 고딕"/>
+                <w:rFonts w:ascii="바탕" w:eastAsia="바탕" w:hAnsi="바탕" w:cs="맑은 고딕"/>
                 <w:szCs w:val="22"/>
                 <w:lang w:eastAsia="ko-KR"/>
               </w:rPr>
@@ -2350,7 +2343,7 @@
       <w:pPr>
         <w:spacing w:line="240" w:lineRule="atLeast"/>
         <w:rPr>
-          <w:rFonts w:ascii="Batang" w:eastAsia="Batang" w:hAnsi="Batang"/>
+          <w:rFonts w:ascii="바탕" w:eastAsia="바탕" w:hAnsi="바탕"/>
           <w:color w:val="000000"/>
           <w:sz w:val="16"/>
           <w:szCs w:val="16"/>
@@ -2362,7 +2355,7 @@
       <w:pPr>
         <w:spacing w:line="240" w:lineRule="atLeast"/>
         <w:rPr>
-          <w:rFonts w:ascii="Batang" w:eastAsia="Batang" w:hAnsi="Batang"/>
+          <w:rFonts w:ascii="바탕" w:eastAsia="바탕" w:hAnsi="바탕"/>
           <w:color w:val="000000"/>
           <w:sz w:val="16"/>
           <w:szCs w:val="16"/>
@@ -2405,14 +2398,14 @@
               <w:spacing w:line="240" w:lineRule="atLeast"/>
               <w:jc w:val="center"/>
               <w:rPr>
-                <w:rFonts w:ascii="Batang" w:eastAsia="Batang" w:hAnsi="Batang"/>
-                <w:sz w:val="22"/>
-                <w:szCs w:val="22"/>
-              </w:rPr>
-            </w:pPr>
-            <w:r>
-              <w:rPr>
-                <w:rFonts w:ascii="Batang" w:eastAsia="Batang" w:hAnsi="Batang" w:hint="eastAsia"/>
+                <w:rFonts w:ascii="바탕" w:eastAsia="바탕" w:hAnsi="바탕"/>
+                <w:sz w:val="22"/>
+                <w:szCs w:val="22"/>
+              </w:rPr>
+            </w:pPr>
+            <w:r>
+              <w:rPr>
+                <w:rFonts w:ascii="바탕" w:eastAsia="바탕" w:hAnsi="바탕" w:hint="eastAsia"/>
                 <w:sz w:val="22"/>
                 <w:szCs w:val="22"/>
               </w:rPr>
@@ -2436,14 +2429,14 @@
               <w:spacing w:line="240" w:lineRule="atLeast"/>
               <w:jc w:val="center"/>
               <w:rPr>
-                <w:rFonts w:ascii="Batang" w:eastAsia="Batang" w:hAnsi="Batang"/>
-                <w:sz w:val="22"/>
-                <w:szCs w:val="22"/>
-              </w:rPr>
-            </w:pPr>
-            <w:r>
-              <w:rPr>
-                <w:rFonts w:ascii="Batang" w:eastAsia="Batang" w:hAnsi="Batang" w:hint="eastAsia"/>
+                <w:rFonts w:ascii="바탕" w:eastAsia="바탕" w:hAnsi="바탕"/>
+                <w:sz w:val="22"/>
+                <w:szCs w:val="22"/>
+              </w:rPr>
+            </w:pPr>
+            <w:r>
+              <w:rPr>
+                <w:rFonts w:ascii="바탕" w:eastAsia="바탕" w:hAnsi="바탕" w:hint="eastAsia"/>
                 <w:sz w:val="22"/>
                 <w:szCs w:val="22"/>
               </w:rPr>
@@ -2465,15 +2458,15 @@
               <w:spacing w:line="240" w:lineRule="atLeast"/>
               <w:jc w:val="center"/>
               <w:rPr>
-                <w:rFonts w:ascii="Batang" w:eastAsia="Batang" w:hAnsi="Batang"/>
-                <w:sz w:val="22"/>
-                <w:szCs w:val="22"/>
-                <w:lang w:eastAsia="ko-KR"/>
-              </w:rPr>
-            </w:pPr>
-            <w:r>
-              <w:rPr>
-                <w:rFonts w:ascii="Batang" w:eastAsia="Batang" w:hAnsi="Batang" w:hint="eastAsia"/>
+                <w:rFonts w:ascii="바탕" w:eastAsia="바탕" w:hAnsi="바탕"/>
+                <w:sz w:val="22"/>
+                <w:szCs w:val="22"/>
+                <w:lang w:eastAsia="ko-KR"/>
+              </w:rPr>
+            </w:pPr>
+            <w:r>
+              <w:rPr>
+                <w:rFonts w:ascii="바탕" w:eastAsia="바탕" w:hAnsi="바탕" w:hint="eastAsia"/>
                 <w:color w:val="000000"/>
                 <w:sz w:val="22"/>
                 <w:szCs w:val="22"/>
@@ -2505,7 +2498,7 @@
               <w:spacing w:line="240" w:lineRule="atLeast"/>
               <w:jc w:val="center"/>
               <w:rPr>
-                <w:rFonts w:ascii="Batang" w:eastAsia="Batang" w:hAnsi="Batang"/>
+                <w:rFonts w:ascii="바탕" w:eastAsia="바탕" w:hAnsi="바탕"/>
                 <w:szCs w:val="22"/>
                 <w:lang w:eastAsia="ko-KR"/>
               </w:rPr>
@@ -2527,7 +2520,7 @@
               <w:spacing w:line="240" w:lineRule="atLeast"/>
               <w:jc w:val="center"/>
               <w:rPr>
-                <w:rFonts w:ascii="Batang" w:eastAsia="Batang" w:hAnsi="Batang"/>
+                <w:rFonts w:ascii="바탕" w:eastAsia="바탕" w:hAnsi="바탕"/>
                 <w:szCs w:val="22"/>
                 <w:lang w:eastAsia="ko-KR"/>
               </w:rPr>
@@ -2548,7 +2541,7 @@
               <w:spacing w:line="240" w:lineRule="atLeast"/>
               <w:jc w:val="left"/>
               <w:rPr>
-                <w:rFonts w:ascii="Batang" w:eastAsia="Batang" w:hAnsi="Batang"/>
+                <w:rFonts w:ascii="바탕" w:eastAsia="바탕" w:hAnsi="바탕"/>
                 <w:szCs w:val="22"/>
                 <w:lang w:eastAsia="ko-KR"/>
               </w:rPr>
@@ -2577,7 +2570,7 @@
               <w:spacing w:line="240" w:lineRule="atLeast"/>
               <w:jc w:val="center"/>
               <w:rPr>
-                <w:rFonts w:ascii="Batang" w:eastAsia="Batang" w:hAnsi="Batang"/>
+                <w:rFonts w:ascii="바탕" w:eastAsia="바탕" w:hAnsi="바탕"/>
                 <w:szCs w:val="22"/>
                 <w:lang w:eastAsia="ko-KR"/>
               </w:rPr>
@@ -2599,7 +2592,7 @@
               <w:spacing w:line="240" w:lineRule="atLeast"/>
               <w:jc w:val="center"/>
               <w:rPr>
-                <w:rFonts w:ascii="Batang" w:eastAsia="Batang" w:hAnsi="Batang"/>
+                <w:rFonts w:ascii="바탕" w:eastAsia="바탕" w:hAnsi="바탕"/>
                 <w:szCs w:val="22"/>
                 <w:lang w:eastAsia="ko-KR"/>
               </w:rPr>
@@ -2620,7 +2613,7 @@
               <w:spacing w:line="240" w:lineRule="atLeast"/>
               <w:jc w:val="left"/>
               <w:rPr>
-                <w:rFonts w:ascii="Batang" w:eastAsia="Batang" w:hAnsi="Batang"/>
+                <w:rFonts w:ascii="바탕" w:eastAsia="바탕" w:hAnsi="바탕"/>
                 <w:szCs w:val="22"/>
                 <w:lang w:eastAsia="ko-KR"/>
               </w:rPr>
@@ -2649,7 +2642,7 @@
               <w:spacing w:line="240" w:lineRule="atLeast"/>
               <w:jc w:val="center"/>
               <w:rPr>
-                <w:rFonts w:ascii="Batang" w:eastAsia="Batang" w:hAnsi="Batang"/>
+                <w:rFonts w:ascii="바탕" w:eastAsia="바탕" w:hAnsi="바탕"/>
                 <w:szCs w:val="22"/>
                 <w:lang w:eastAsia="ko-KR"/>
               </w:rPr>
@@ -2671,7 +2664,7 @@
               <w:spacing w:line="240" w:lineRule="atLeast"/>
               <w:jc w:val="center"/>
               <w:rPr>
-                <w:rFonts w:ascii="Batang" w:eastAsia="Batang" w:hAnsi="Batang"/>
+                <w:rFonts w:ascii="바탕" w:eastAsia="바탕" w:hAnsi="바탕"/>
                 <w:szCs w:val="22"/>
                 <w:lang w:eastAsia="ko-KR"/>
               </w:rPr>
@@ -2692,7 +2685,7 @@
               <w:spacing w:line="240" w:lineRule="atLeast"/>
               <w:jc w:val="left"/>
               <w:rPr>
-                <w:rFonts w:ascii="Batang" w:eastAsia="Batang" w:hAnsi="Batang" w:cs="Batang"/>
+                <w:rFonts w:ascii="바탕" w:eastAsia="바탕" w:hAnsi="바탕" w:cs="바탕"/>
                 <w:szCs w:val="22"/>
                 <w:lang w:eastAsia="ko-KR"/>
               </w:rPr>
@@ -2721,7 +2714,7 @@
               <w:spacing w:line="240" w:lineRule="atLeast"/>
               <w:jc w:val="center"/>
               <w:rPr>
-                <w:rFonts w:ascii="Batang" w:eastAsia="Batang" w:hAnsi="Batang"/>
+                <w:rFonts w:ascii="바탕" w:eastAsia="바탕" w:hAnsi="바탕"/>
                 <w:szCs w:val="22"/>
                 <w:lang w:eastAsia="ko-KR"/>
               </w:rPr>
@@ -2743,7 +2736,7 @@
               <w:spacing w:line="240" w:lineRule="atLeast"/>
               <w:jc w:val="center"/>
               <w:rPr>
-                <w:rFonts w:ascii="Batang" w:eastAsia="Batang" w:hAnsi="Batang"/>
+                <w:rFonts w:ascii="바탕" w:eastAsia="바탕" w:hAnsi="바탕"/>
                 <w:szCs w:val="22"/>
               </w:rPr>
             </w:pPr>
@@ -2763,7 +2756,7 @@
               <w:spacing w:line="240" w:lineRule="atLeast"/>
               <w:jc w:val="left"/>
               <w:rPr>
-                <w:rFonts w:ascii="Batang" w:eastAsia="Batang" w:hAnsi="Batang"/>
+                <w:rFonts w:ascii="바탕" w:eastAsia="바탕" w:hAnsi="바탕"/>
                 <w:szCs w:val="22"/>
                 <w:lang w:eastAsia="ko-KR"/>
               </w:rPr>
@@ -2943,7 +2936,7 @@
 </file>
 
 <file path=word/endnotes.xml><?xml version="1.0" encoding="utf-8"?>
-<w:endnotes xmlns:wpc="http://schemas.microsoft.com/office/word/2010/wordprocessingCanvas" xmlns:cx="http://schemas.microsoft.com/office/drawing/2014/chartex" xmlns:cx1="http://schemas.microsoft.com/office/drawing/2015/9/8/chartex" xmlns:cx2="http://schemas.microsoft.com/office/drawing/2015/10/21/chartex" xmlns:cx3="http://schemas.microsoft.com/office/drawing/2016/5/9/chartex" xmlns:cx4="http://schemas.microsoft.com/office/drawing/2016/5/10/chartex" xmlns:cx5="http://schemas.microsoft.com/office/drawing/2016/5/11/chartex" xmlns:cx6="http://schemas.microsoft.com/office/drawing/2016/5/12/chartex" xmlns:cx7="http://schemas.microsoft.com/office/drawing/2016/5/13/chartex" xmlns:cx8="http://schemas.microsoft.com/office/drawing/2016/5/14/chartex" xmlns:mc="http://schemas.openxmlformats.org/markup-compatibility/2006" xmlns:aink="http://schemas.microsoft.com/office/drawing/2016/ink" xmlns:am3d="http://schemas.microsoft.com/office/drawing/2017/model3d" xmlns:o="urn:schemas-microsoft-com:office:office" xmlns:oel="http://schemas.microsoft.com/office/2019/extlst" xmlns:r="http://schemas.openxmlformats.org/officeDocument/2006/relationships" xmlns:m="http://schemas.openxmlformats.org/officeDocument/2006/math" xmlns:v="urn:schemas-microsoft-com:vml" xmlns:wp14="http://schemas.microsoft.com/office/word/2010/wordprocessingDrawing" xmlns:wp="http://schemas.openxmlformats.org/drawingml/2006/wordprocessingDrawing" xmlns:w10="urn:schemas-microsoft-com:office:word" xmlns:w="http://schemas.openxmlformats.org/wordprocessingml/2006/main" xmlns:w14="http://schemas.microsoft.com/office/word/2010/wordml" xmlns:w15="http://schemas.microsoft.com/office/word/2012/wordml" xmlns:w16cex="http://schemas.microsoft.com/office/word/2018/wordml/cex" xmlns:w16cid="http://schemas.microsoft.com/office/word/2016/wordml/cid" xmlns:w16="http://schemas.microsoft.com/office/word/2018/wordml" xmlns:w16du="http://schemas.microsoft.com/office/word/2023/wordml/word16du" xmlns:w16sdtdh="http://schemas.microsoft.com/office/word/2020/wordml/sdtdatahash" xmlns:w16sdtfl="http://schemas.microsoft.com/office/word/2024/wordml/sdtformatlock" xmlns:w16se="http://schemas.microsoft.com/office/word/2015/wordml/symex" xmlns:wpg="http://schemas.microsoft.com/office/word/2010/wordprocessingGroup" xmlns:wpi="http://schemas.microsoft.com/office/word/2010/wordprocessingInk" xmlns:wne="http://schemas.microsoft.com/office/word/2006/wordml" xmlns:wps="http://schemas.microsoft.com/office/word/2010/wordprocessingShape" mc:Ignorable="w14 w15 w16se w16cid w16 w16cex w16sdtdh w16sdtfl w16du wp14">
+<w:endnotes xmlns:wpc="http://schemas.microsoft.com/office/word/2010/wordprocessingCanvas" xmlns:cx="http://schemas.microsoft.com/office/drawing/2014/chartex" xmlns:cx1="http://schemas.microsoft.com/office/drawing/2015/9/8/chartex" xmlns:cx2="http://schemas.microsoft.com/office/drawing/2015/10/21/chartex" xmlns:cx3="http://schemas.microsoft.com/office/drawing/2016/5/9/chartex" xmlns:cx4="http://schemas.microsoft.com/office/drawing/2016/5/10/chartex" xmlns:cx5="http://schemas.microsoft.com/office/drawing/2016/5/11/chartex" xmlns:cx6="http://schemas.microsoft.com/office/drawing/2016/5/12/chartex" xmlns:cx7="http://schemas.microsoft.com/office/drawing/2016/5/13/chartex" xmlns:cx8="http://schemas.microsoft.com/office/drawing/2016/5/14/chartex" xmlns:mc="http://schemas.openxmlformats.org/markup-compatibility/2006" xmlns:m="http://schemas.openxmlformats.org/officeDocument/2006/math" xmlns:aink="http://schemas.microsoft.com/office/drawing/2016/ink" xmlns:am3d="http://schemas.microsoft.com/office/drawing/2017/model3d" xmlns:oel="http://schemas.microsoft.com/office/2019/extlst" xmlns:r="http://schemas.openxmlformats.org/officeDocument/2006/relationships" xmlns:wp14="http://schemas.microsoft.com/office/word/2010/wordprocessingDrawing" xmlns:wp="http://schemas.openxmlformats.org/drawingml/2006/wordprocessingDrawing" xmlns:wpg="http://schemas.microsoft.com/office/word/2010/wordprocessingGroup" xmlns:wpi="http://schemas.microsoft.com/office/word/2010/wordprocessingInk" xmlns:wps="http://schemas.microsoft.com/office/word/2010/wordprocessingShape" xmlns:o="urn:schemas-microsoft-com:office:office" xmlns:v="urn:schemas-microsoft-com:vml" xmlns:w10="urn:schemas-microsoft-com:office:word" xmlns:w="http://schemas.openxmlformats.org/wordprocessingml/2006/main" xmlns:w14="http://schemas.microsoft.com/office/word/2010/wordml" xmlns:w15="http://schemas.microsoft.com/office/word/2012/wordml" xmlns:w16cex="http://schemas.microsoft.com/office/word/2018/wordml/cex" xmlns:w16cid="http://schemas.microsoft.com/office/word/2016/wordml/cid" xmlns:w16="http://schemas.microsoft.com/office/word/2018/wordml" xmlns:w16sdtdh="http://schemas.microsoft.com/office/word/2020/wordml/sdtdatahash" xmlns:w16sdtfl="http://schemas.microsoft.com/office/word/2024/wordml/sdtformatlock" xmlns:w16se="http://schemas.microsoft.com/office/word/2015/wordml/symex" xmlns:w16du="http://schemas.microsoft.com/office/word/2023/wordml/word16du" xmlns:wne="http://schemas.microsoft.com/office/word/2006/wordml" mc:Ignorable="w14 w15 w16se w16cid w16 w16cex w16sdtdh w16sdtfl w16du wp14">
   <w:endnote w:type="separator" w:id="-1">
     <w:p>
       <w:r>
@@ -2962,7 +2955,7 @@
 </file>
 
 <file path=word/footnotes.xml><?xml version="1.0" encoding="utf-8"?>
-<w:footnotes xmlns:wpc="http://schemas.microsoft.com/office/word/2010/wordprocessingCanvas" xmlns:cx="http://schemas.microsoft.com/office/drawing/2014/chartex" xmlns:cx1="http://schemas.microsoft.com/office/drawing/2015/9/8/chartex" xmlns:cx2="http://schemas.microsoft.com/office/drawing/2015/10/21/chartex" xmlns:cx3="http://schemas.microsoft.com/office/drawing/2016/5/9/chartex" xmlns:cx4="http://schemas.microsoft.com/office/drawing/2016/5/10/chartex" xmlns:cx5="http://schemas.microsoft.com/office/drawing/2016/5/11/chartex" xmlns:cx6="http://schemas.microsoft.com/office/drawing/2016/5/12/chartex" xmlns:cx7="http://schemas.microsoft.com/office/drawing/2016/5/13/chartex" xmlns:cx8="http://schemas.microsoft.com/office/drawing/2016/5/14/chartex" xmlns:mc="http://schemas.openxmlformats.org/markup-compatibility/2006" xmlns:aink="http://schemas.microsoft.com/office/drawing/2016/ink" xmlns:am3d="http://schemas.microsoft.com/office/drawing/2017/model3d" xmlns:o="urn:schemas-microsoft-com:office:office" xmlns:oel="http://schemas.microsoft.com/office/2019/extlst" xmlns:r="http://schemas.openxmlformats.org/officeDocument/2006/relationships" xmlns:m="http://schemas.openxmlformats.org/officeDocument/2006/math" xmlns:v="urn:schemas-microsoft-com:vml" xmlns:wp14="http://schemas.microsoft.com/office/word/2010/wordprocessingDrawing" xmlns:wp="http://schemas.openxmlformats.org/drawingml/2006/wordprocessingDrawing" xmlns:w10="urn:schemas-microsoft-com:office:word" xmlns:w="http://schemas.openxmlformats.org/wordprocessingml/2006/main" xmlns:w14="http://schemas.microsoft.com/office/word/2010/wordml" xmlns:w15="http://schemas.microsoft.com/office/word/2012/wordml" xmlns:w16cex="http://schemas.microsoft.com/office/word/2018/wordml/cex" xmlns:w16cid="http://schemas.microsoft.com/office/word/2016/wordml/cid" xmlns:w16="http://schemas.microsoft.com/office/word/2018/wordml" xmlns:w16du="http://schemas.microsoft.com/office/word/2023/wordml/word16du" xmlns:w16sdtdh="http://schemas.microsoft.com/office/word/2020/wordml/sdtdatahash" xmlns:w16sdtfl="http://schemas.microsoft.com/office/word/2024/wordml/sdtformatlock" xmlns:w16se="http://schemas.microsoft.com/office/word/2015/wordml/symex" xmlns:wpg="http://schemas.microsoft.com/office/word/2010/wordprocessingGroup" xmlns:wpi="http://schemas.microsoft.com/office/word/2010/wordprocessingInk" xmlns:wne="http://schemas.microsoft.com/office/word/2006/wordml" xmlns:wps="http://schemas.microsoft.com/office/word/2010/wordprocessingShape" mc:Ignorable="w14 w15 w16se w16cid w16 w16cex w16sdtdh w16sdtfl w16du wp14">
+<w:footnotes xmlns:wpc="http://schemas.microsoft.com/office/word/2010/wordprocessingCanvas" xmlns:cx="http://schemas.microsoft.com/office/drawing/2014/chartex" xmlns:cx1="http://schemas.microsoft.com/office/drawing/2015/9/8/chartex" xmlns:cx2="http://schemas.microsoft.com/office/drawing/2015/10/21/chartex" xmlns:cx3="http://schemas.microsoft.com/office/drawing/2016/5/9/chartex" xmlns:cx4="http://schemas.microsoft.com/office/drawing/2016/5/10/chartex" xmlns:cx5="http://schemas.microsoft.com/office/drawing/2016/5/11/chartex" xmlns:cx6="http://schemas.microsoft.com/office/drawing/2016/5/12/chartex" xmlns:cx7="http://schemas.microsoft.com/office/drawing/2016/5/13/chartex" xmlns:cx8="http://schemas.microsoft.com/office/drawing/2016/5/14/chartex" xmlns:mc="http://schemas.openxmlformats.org/markup-compatibility/2006" xmlns:m="http://schemas.openxmlformats.org/officeDocument/2006/math" xmlns:aink="http://schemas.microsoft.com/office/drawing/2016/ink" xmlns:am3d="http://schemas.microsoft.com/office/drawing/2017/model3d" xmlns:oel="http://schemas.microsoft.com/office/2019/extlst" xmlns:r="http://schemas.openxmlformats.org/officeDocument/2006/relationships" xmlns:wp14="http://schemas.microsoft.com/office/word/2010/wordprocessingDrawing" xmlns:wp="http://schemas.openxmlformats.org/drawingml/2006/wordprocessingDrawing" xmlns:wpg="http://schemas.microsoft.com/office/word/2010/wordprocessingGroup" xmlns:wpi="http://schemas.microsoft.com/office/word/2010/wordprocessingInk" xmlns:wps="http://schemas.microsoft.com/office/word/2010/wordprocessingShape" xmlns:o="urn:schemas-microsoft-com:office:office" xmlns:v="urn:schemas-microsoft-com:vml" xmlns:w10="urn:schemas-microsoft-com:office:word" xmlns:w="http://schemas.openxmlformats.org/wordprocessingml/2006/main" xmlns:w14="http://schemas.microsoft.com/office/word/2010/wordml" xmlns:w15="http://schemas.microsoft.com/office/word/2012/wordml" xmlns:w16cex="http://schemas.microsoft.com/office/word/2018/wordml/cex" xmlns:w16cid="http://schemas.microsoft.com/office/word/2016/wordml/cid" xmlns:w16="http://schemas.microsoft.com/office/word/2018/wordml" xmlns:w16sdtdh="http://schemas.microsoft.com/office/word/2020/wordml/sdtdatahash" xmlns:w16sdtfl="http://schemas.microsoft.com/office/word/2024/wordml/sdtformatlock" xmlns:w16se="http://schemas.microsoft.com/office/word/2015/wordml/symex" xmlns:w16du="http://schemas.microsoft.com/office/word/2023/wordml/word16du" xmlns:wne="http://schemas.microsoft.com/office/word/2006/wordml" mc:Ignorable="w14 w15 w16se w16cid w16 w16cex w16sdtdh w16sdtfl w16du wp14">
   <w:footnote w:type="separator" w:id="-1">
     <w:p>
       <w:r>
@@ -2981,7 +2974,7 @@
 </file>
 
 <file path=word/styles.xml><?xml version="1.0" encoding="utf-8"?>
-<w:styles xmlns:mc="http://schemas.openxmlformats.org/markup-compatibility/2006" xmlns:r="http://schemas.openxmlformats.org/officeDocument/2006/relationships" xmlns:w="http://schemas.openxmlformats.org/wordprocessingml/2006/main" xmlns:w14="http://schemas.microsoft.com/office/word/2010/wordml" xmlns:w15="http://schemas.microsoft.com/office/word/2012/wordml" xmlns:w16cex="http://schemas.microsoft.com/office/word/2018/wordml/cex" xmlns:w16cid="http://schemas.microsoft.com/office/word/2016/wordml/cid" xmlns:w16="http://schemas.microsoft.com/office/word/2018/wordml" xmlns:w16du="http://schemas.microsoft.com/office/word/2023/wordml/word16du" xmlns:w16sdtdh="http://schemas.microsoft.com/office/word/2020/wordml/sdtdatahash" xmlns:w16sdtfl="http://schemas.microsoft.com/office/word/2024/wordml/sdtformatlock" xmlns:w16se="http://schemas.microsoft.com/office/word/2015/wordml/symex" mc:Ignorable="w14 w15 w16se w16cid w16 w16cex w16sdtdh w16sdtfl w16du">
+<w:styles xmlns:mc="http://schemas.openxmlformats.org/markup-compatibility/2006" xmlns:r="http://schemas.openxmlformats.org/officeDocument/2006/relationships" xmlns:w="http://schemas.openxmlformats.org/wordprocessingml/2006/main" xmlns:w14="http://schemas.microsoft.com/office/word/2010/wordml" xmlns:w15="http://schemas.microsoft.com/office/word/2012/wordml" xmlns:w16cex="http://schemas.microsoft.com/office/word/2018/wordml/cex" xmlns:w16cid="http://schemas.microsoft.com/office/word/2016/wordml/cid" xmlns:w16="http://schemas.microsoft.com/office/word/2018/wordml" xmlns:w16sdtdh="http://schemas.microsoft.com/office/word/2020/wordml/sdtdatahash" xmlns:w16sdtfl="http://schemas.microsoft.com/office/word/2024/wordml/sdtformatlock" xmlns:w16se="http://schemas.microsoft.com/office/word/2015/wordml/symex" xmlns:w16du="http://schemas.microsoft.com/office/word/2023/wordml/word16du" mc:Ignorable="w14 w15 w16se w16cid w16 w16cex w16sdtdh w16sdtfl w16du">
   <w:docDefaults>
     <w:rPrDefault>
       <w:rPr>

</xml_diff>

<commit_message>
Update resume template to supplied contact-free version
</commit_message>
<xml_diff>
--- a/public/templates/onli-interpreter-resume.docx
+++ b/public/templates/onli-interpreter-resume.docx
@@ -17,12 +17,11 @@
         <w:gridCol w:w="709"/>
         <w:gridCol w:w="2835"/>
         <w:gridCol w:w="1701"/>
-        <w:gridCol w:w="850"/>
-        <w:gridCol w:w="2552"/>
+        <w:gridCol w:w="3402"/>
       </w:tblGrid>
       <w:tr>
         <w:trPr>
-          <w:gridAfter w:val="2"/>
+          <w:gridAfter w:val="1"/>
           <w:wAfter w:w="3402" w:type="dxa"/>
           <w:trHeight w:val="844"/>
         </w:trPr>
@@ -341,7 +340,7 @@
       </w:tr>
       <w:tr>
         <w:trPr>
-          <w:gridAfter w:val="2"/>
+          <w:gridAfter w:val="1"/>
           <w:wAfter w:w="3402" w:type="dxa"/>
           <w:trHeight w:hRule="exact" w:val="510"/>
         </w:trPr>
@@ -397,7 +396,7 @@
       </w:tr>
       <w:tr>
         <w:trPr>
-          <w:gridAfter w:val="2"/>
+          <w:gridAfter w:val="1"/>
           <w:wAfter w:w="3402" w:type="dxa"/>
           <w:trHeight w:hRule="exact" w:val="907"/>
         </w:trPr>
@@ -472,7 +471,7 @@
       </w:tr>
       <w:tr>
         <w:trPr>
-          <w:gridAfter w:val="2"/>
+          <w:gridAfter w:val="1"/>
           <w:wAfter w:w="3402" w:type="dxa"/>
           <w:trHeight w:hRule="exact" w:val="510"/>
         </w:trPr>
@@ -683,286 +682,6 @@
               </w:rPr>
               <w:t>00</w:t>
             </w:r>
-          </w:p>
-        </w:tc>
-      </w:tr>
-      <w:tr>
-        <w:trPr>
-          <w:trHeight w:hRule="exact" w:val="510"/>
-        </w:trPr>
-        <w:tc>
-          <w:tcPr>
-            <w:tcW w:w="981" w:type="dxa"/>
-            <w:tcBorders>
-              <w:top w:val="single" w:sz="4" w:space="0" w:color="auto"/>
-              <w:left w:val="single" w:sz="4" w:space="0" w:color="auto"/>
-              <w:bottom w:val="dotted" w:sz="4" w:space="0" w:color="auto"/>
-              <w:right w:val="nil"/>
-            </w:tcBorders>
-            <w:vAlign w:val="center"/>
-          </w:tcPr>
-          <w:p>
-            <w:pPr>
-              <w:rPr>
-                <w:rFonts w:ascii="바탕" w:eastAsia="바탕" w:hAnsi="바탕"/>
-                <w:sz w:val="18"/>
-                <w:szCs w:val="18"/>
-                <w:lang w:eastAsia="ko-KR"/>
-              </w:rPr>
-            </w:pPr>
-          </w:p>
-        </w:tc>
-        <w:tc>
-          <w:tcPr>
-            <w:tcW w:w="9639" w:type="dxa"/>
-            <w:gridSpan w:val="7"/>
-            <w:tcBorders>
-              <w:top w:val="single" w:sz="4" w:space="0" w:color="auto"/>
-              <w:left w:val="nil"/>
-              <w:bottom w:val="dotted" w:sz="4" w:space="0" w:color="auto"/>
-              <w:right w:val="single" w:sz="4" w:space="0" w:color="auto"/>
-            </w:tcBorders>
-            <w:vAlign w:val="center"/>
-          </w:tcPr>
-          <w:p>
-            <w:pPr>
-              <w:rPr>
-                <w:rFonts w:ascii="바탕" w:eastAsia="바탕" w:hAnsi="바탕"/>
-                <w:szCs w:val="22"/>
-              </w:rPr>
-            </w:pPr>
-          </w:p>
-        </w:tc>
-      </w:tr>
-      <w:tr>
-        <w:trPr>
-          <w:trHeight w:hRule="exact" w:val="340"/>
-        </w:trPr>
-        <w:tc>
-          <w:tcPr>
-            <w:tcW w:w="10620" w:type="dxa"/>
-            <w:gridSpan w:val="8"/>
-            <w:tcBorders>
-              <w:top w:val="dotted" w:sz="4" w:space="0" w:color="auto"/>
-              <w:left w:val="single" w:sz="4" w:space="0" w:color="auto"/>
-              <w:bottom w:val="nil"/>
-              <w:right w:val="single" w:sz="4" w:space="0" w:color="auto"/>
-            </w:tcBorders>
-            <w:vAlign w:val="center"/>
-          </w:tcPr>
-          <w:p>
-            <w:pPr>
-              <w:jc w:val="left"/>
-              <w:rPr>
-                <w:rFonts w:ascii="바탕" w:eastAsia="바탕" w:hAnsi="바탕"/>
-                <w:sz w:val="22"/>
-                <w:szCs w:val="22"/>
-              </w:rPr>
-            </w:pPr>
-            <w:r>
-              <w:rPr>
-                <w:rFonts w:ascii="바탕" w:eastAsia="바탕" w:hAnsi="바탕" w:hint="eastAsia"/>
-                <w:sz w:val="22"/>
-                <w:szCs w:val="22"/>
-                <w:lang w:eastAsia="ko-KR"/>
-              </w:rPr>
-              <w:t xml:space="preserve">일본 </w:t>
-            </w:r>
-            <w:r>
-              <w:rPr>
-                <w:rFonts w:ascii="바탕" w:eastAsia="바탕" w:hAnsi="바탕" w:hint="eastAsia"/>
-                <w:sz w:val="22"/>
-                <w:szCs w:val="22"/>
-                <w:lang w:eastAsia="ko-KR"/>
-              </w:rPr>
-              <w:t>현주소</w:t>
-            </w:r>
-            <w:r>
-              <w:rPr>
-                <w:rFonts w:ascii="바탕" w:eastAsia="바탕" w:hAnsi="바탕" w:hint="eastAsia"/>
-                <w:sz w:val="22"/>
-                <w:szCs w:val="22"/>
-              </w:rPr>
-              <w:t>（</w:t>
-            </w:r>
-            <w:r>
-              <w:rPr>
-                <w:rFonts w:ascii="Apple SD Gothic Neo" w:eastAsia="Apple SD Gothic Neo" w:hAnsi="Apple SD Gothic Neo" w:cs="Apple SD Gothic Neo" w:hint="eastAsia"/>
-                <w:sz w:val="22"/>
-                <w:szCs w:val="22"/>
-              </w:rPr>
-              <w:t>〒</w:t>
-            </w:r>
-            <w:r>
-              <w:rPr>
-                <w:rFonts w:ascii="Apple SD Gothic Neo" w:eastAsia="Apple SD Gothic Neo" w:hAnsi="Apple SD Gothic Neo" w:cs="Apple SD Gothic Neo" w:hint="eastAsia"/>
-                <w:sz w:val="22"/>
-                <w:szCs w:val="22"/>
-                <w:lang w:eastAsia="ko-KR"/>
-              </w:rPr>
-              <w:t xml:space="preserve"> </w:t>
-            </w:r>
-            <w:r>
-              <w:rPr>
-                <w:rFonts w:ascii="바탕" w:eastAsia="바탕" w:hAnsi="바탕" w:hint="eastAsia"/>
-                <w:sz w:val="22"/>
-                <w:szCs w:val="22"/>
-              </w:rPr>
-              <w:t>-</w:t>
-            </w:r>
-            <w:r>
-              <w:rPr>
-                <w:rFonts w:ascii="바탕" w:eastAsia="바탕" w:hAnsi="바탕" w:hint="eastAsia"/>
-                <w:sz w:val="22"/>
-                <w:szCs w:val="22"/>
-                <w:lang w:eastAsia="ko-KR"/>
-              </w:rPr>
-              <w:t xml:space="preserve"> </w:t>
-            </w:r>
-            <w:r>
-              <w:rPr>
-                <w:rFonts w:ascii="바탕" w:eastAsia="바탕" w:hAnsi="바탕" w:hint="eastAsia"/>
-                <w:sz w:val="22"/>
-                <w:szCs w:val="22"/>
-              </w:rPr>
-              <w:t>）</w:t>
-            </w:r>
-          </w:p>
-        </w:tc>
-      </w:tr>
-      <w:tr>
-        <w:trPr>
-          <w:trHeight w:hRule="exact" w:val="680"/>
-        </w:trPr>
-        <w:tc>
-          <w:tcPr>
-            <w:tcW w:w="10620" w:type="dxa"/>
-            <w:gridSpan w:val="8"/>
-            <w:tcBorders>
-              <w:top w:val="nil"/>
-              <w:left w:val="single" w:sz="4" w:space="0" w:color="auto"/>
-              <w:bottom w:val="single" w:sz="4" w:space="0" w:color="auto"/>
-              <w:right w:val="single" w:sz="4" w:space="0" w:color="auto"/>
-            </w:tcBorders>
-            <w:vAlign w:val="center"/>
-          </w:tcPr>
-          <w:p>
-            <w:pPr>
-              <w:jc w:val="left"/>
-              <w:rPr>
-                <w:rFonts w:ascii="바탕" w:eastAsia="바탕" w:hAnsi="바탕"/>
-                <w:sz w:val="32"/>
-                <w:szCs w:val="22"/>
-              </w:rPr>
-            </w:pPr>
-          </w:p>
-        </w:tc>
-      </w:tr>
-      <w:tr>
-        <w:trPr>
-          <w:trHeight w:val="680"/>
-        </w:trPr>
-        <w:tc>
-          <w:tcPr>
-            <w:tcW w:w="981" w:type="dxa"/>
-            <w:tcBorders>
-              <w:top w:val="nil"/>
-              <w:left w:val="single" w:sz="4" w:space="0" w:color="auto"/>
-              <w:bottom w:val="single" w:sz="4" w:space="0" w:color="auto"/>
-              <w:right w:val="nil"/>
-            </w:tcBorders>
-            <w:vAlign w:val="center"/>
-          </w:tcPr>
-          <w:p>
-            <w:pPr>
-              <w:rPr>
-                <w:rFonts w:ascii="바탕" w:eastAsia="바탕" w:hAnsi="바탕"/>
-                <w:sz w:val="22"/>
-                <w:szCs w:val="22"/>
-              </w:rPr>
-            </w:pPr>
-            <w:r>
-              <w:rPr>
-                <w:rFonts w:ascii="바탕" w:eastAsia="바탕" w:hAnsi="바탕"/>
-                <w:sz w:val="22"/>
-                <w:szCs w:val="22"/>
-              </w:rPr>
-              <w:t>E-Mail</w:t>
-            </w:r>
-          </w:p>
-        </w:tc>
-        <w:tc>
-          <w:tcPr>
-            <w:tcW w:w="6237" w:type="dxa"/>
-            <w:gridSpan w:val="5"/>
-            <w:tcBorders>
-              <w:top w:val="nil"/>
-              <w:left w:val="nil"/>
-              <w:bottom w:val="single" w:sz="4" w:space="0" w:color="auto"/>
-              <w:right w:val="single" w:sz="4" w:space="0" w:color="auto"/>
-            </w:tcBorders>
-            <w:vAlign w:val="center"/>
-          </w:tcPr>
-          <w:p>
-            <w:pPr>
-              <w:rPr>
-                <w:rFonts w:ascii="바탕" w:eastAsia="바탕" w:hAnsi="바탕"/>
-                <w:szCs w:val="22"/>
-              </w:rPr>
-            </w:pPr>
-          </w:p>
-        </w:tc>
-        <w:tc>
-          <w:tcPr>
-            <w:tcW w:w="850" w:type="dxa"/>
-            <w:tcBorders>
-              <w:top w:val="nil"/>
-              <w:left w:val="single" w:sz="4" w:space="0" w:color="auto"/>
-              <w:bottom w:val="single" w:sz="4" w:space="0" w:color="auto"/>
-              <w:right w:val="nil"/>
-            </w:tcBorders>
-            <w:vAlign w:val="center"/>
-          </w:tcPr>
-          <w:p>
-            <w:pPr>
-              <w:jc w:val="left"/>
-              <w:rPr>
-                <w:rFonts w:ascii="바탕" w:eastAsia="바탕" w:hAnsi="바탕" w:cs="바탕"/>
-                <w:sz w:val="22"/>
-                <w:szCs w:val="22"/>
-                <w:lang w:eastAsia="ko-KR"/>
-              </w:rPr>
-            </w:pPr>
-            <w:r>
-              <w:rPr>
-                <w:rFonts w:ascii="바탕" w:eastAsia="바탕" w:hAnsi="바탕" w:cs="맑은 고딕" w:hint="eastAsia"/>
-                <w:sz w:val="22"/>
-                <w:szCs w:val="22"/>
-                <w:lang w:eastAsia="ko-KR"/>
-              </w:rPr>
-              <w:t>번호</w:t>
-            </w:r>
-          </w:p>
-        </w:tc>
-        <w:tc>
-          <w:tcPr>
-            <w:tcW w:w="2552" w:type="dxa"/>
-            <w:tcBorders>
-              <w:top w:val="nil"/>
-              <w:left w:val="nil"/>
-              <w:bottom w:val="single" w:sz="4" w:space="0" w:color="auto"/>
-              <w:right w:val="single" w:sz="4" w:space="0" w:color="auto"/>
-            </w:tcBorders>
-            <w:vAlign w:val="center"/>
-          </w:tcPr>
-          <w:p>
-            <w:pPr>
-              <w:rPr>
-                <w:rFonts w:ascii="바탕" w:eastAsia="바탕" w:hAnsi="바탕"/>
-                <w:szCs w:val="22"/>
-                <w:lang w:eastAsia="ko-KR"/>
-              </w:rPr>
-            </w:pPr>
           </w:p>
         </w:tc>
       </w:tr>
@@ -973,7 +692,7 @@
         <w:tc>
           <w:tcPr>
             <w:tcW w:w="10620" w:type="dxa"/>
-            <w:gridSpan w:val="8"/>
+            <w:gridSpan w:val="7"/>
             <w:tcBorders>
               <w:top w:val="nil"/>
               <w:left w:val="nil"/>
@@ -1054,7 +773,7 @@
         <w:tc>
           <w:tcPr>
             <w:tcW w:w="8647" w:type="dxa"/>
-            <w:gridSpan w:val="5"/>
+            <w:gridSpan w:val="4"/>
             <w:vAlign w:val="center"/>
           </w:tcPr>
           <w:p>
@@ -1193,7 +912,7 @@
         <w:tc>
           <w:tcPr>
             <w:tcW w:w="8647" w:type="dxa"/>
-            <w:gridSpan w:val="5"/>
+            <w:gridSpan w:val="4"/>
             <w:tcBorders>
               <w:bottom w:val="dotted" w:sz="4" w:space="0" w:color="auto"/>
             </w:tcBorders>
@@ -1269,7 +988,7 @@
         <w:tc>
           <w:tcPr>
             <w:tcW w:w="8647" w:type="dxa"/>
-            <w:gridSpan w:val="5"/>
+            <w:gridSpan w:val="4"/>
             <w:tcBorders>
               <w:top w:val="dotted" w:sz="4" w:space="0" w:color="auto"/>
               <w:bottom w:val="dotted" w:sz="4" w:space="0" w:color="auto"/>
@@ -1338,7 +1057,7 @@
         <w:tc>
           <w:tcPr>
             <w:tcW w:w="8647" w:type="dxa"/>
-            <w:gridSpan w:val="5"/>
+            <w:gridSpan w:val="4"/>
             <w:tcBorders>
               <w:top w:val="dotted" w:sz="4" w:space="0" w:color="auto"/>
               <w:bottom w:val="dotted" w:sz="4" w:space="0" w:color="auto"/>
@@ -1409,7 +1128,7 @@
         <w:tc>
           <w:tcPr>
             <w:tcW w:w="8647" w:type="dxa"/>
-            <w:gridSpan w:val="5"/>
+            <w:gridSpan w:val="4"/>
             <w:tcBorders>
               <w:top w:val="dotted" w:sz="4" w:space="0" w:color="auto"/>
               <w:bottom w:val="dotted" w:sz="4" w:space="0" w:color="auto"/>
@@ -1486,7 +1205,7 @@
         <w:tc>
           <w:tcPr>
             <w:tcW w:w="8647" w:type="dxa"/>
-            <w:gridSpan w:val="5"/>
+            <w:gridSpan w:val="4"/>
             <w:tcBorders>
               <w:top w:val="dotted" w:sz="4" w:space="0" w:color="auto"/>
               <w:bottom w:val="dotted" w:sz="4" w:space="0" w:color="auto"/>
@@ -1555,7 +1274,7 @@
         <w:tc>
           <w:tcPr>
             <w:tcW w:w="8647" w:type="dxa"/>
-            <w:gridSpan w:val="5"/>
+            <w:gridSpan w:val="4"/>
             <w:tcBorders>
               <w:top w:val="dotted" w:sz="4" w:space="0" w:color="auto"/>
               <w:bottom w:val="dotted" w:sz="4" w:space="0" w:color="auto"/>
@@ -1624,7 +1343,7 @@
         <w:tc>
           <w:tcPr>
             <w:tcW w:w="8647" w:type="dxa"/>
-            <w:gridSpan w:val="5"/>
+            <w:gridSpan w:val="4"/>
             <w:tcBorders>
               <w:top w:val="dotted" w:sz="4" w:space="0" w:color="auto"/>
               <w:bottom w:val="dotted" w:sz="4" w:space="0" w:color="auto"/>
@@ -1693,7 +1412,7 @@
         <w:tc>
           <w:tcPr>
             <w:tcW w:w="8647" w:type="dxa"/>
-            <w:gridSpan w:val="5"/>
+            <w:gridSpan w:val="4"/>
             <w:tcBorders>
               <w:top w:val="dotted" w:sz="4" w:space="0" w:color="auto"/>
               <w:bottom w:val="dotted" w:sz="4" w:space="0" w:color="auto"/>
@@ -1762,7 +1481,7 @@
         <w:tc>
           <w:tcPr>
             <w:tcW w:w="8647" w:type="dxa"/>
-            <w:gridSpan w:val="5"/>
+            <w:gridSpan w:val="4"/>
             <w:tcBorders>
               <w:top w:val="dotted" w:sz="4" w:space="0" w:color="auto"/>
               <w:bottom w:val="dotted" w:sz="4" w:space="0" w:color="auto"/>
@@ -1831,7 +1550,7 @@
         <w:tc>
           <w:tcPr>
             <w:tcW w:w="8647" w:type="dxa"/>
-            <w:gridSpan w:val="5"/>
+            <w:gridSpan w:val="4"/>
             <w:tcBorders>
               <w:top w:val="dotted" w:sz="4" w:space="0" w:color="auto"/>
               <w:bottom w:val="dotted" w:sz="4" w:space="0" w:color="auto"/>
@@ -1900,7 +1619,7 @@
         <w:tc>
           <w:tcPr>
             <w:tcW w:w="8647" w:type="dxa"/>
-            <w:gridSpan w:val="5"/>
+            <w:gridSpan w:val="4"/>
             <w:tcBorders>
               <w:top w:val="dotted" w:sz="4" w:space="0" w:color="auto"/>
               <w:bottom w:val="dotted" w:sz="4" w:space="0" w:color="auto"/>
@@ -1969,7 +1688,7 @@
         <w:tc>
           <w:tcPr>
             <w:tcW w:w="8647" w:type="dxa"/>
-            <w:gridSpan w:val="5"/>
+            <w:gridSpan w:val="4"/>
             <w:tcBorders>
               <w:top w:val="dotted" w:sz="4" w:space="0" w:color="auto"/>
               <w:bottom w:val="dotted" w:sz="4" w:space="0" w:color="auto"/>
@@ -2038,7 +1757,7 @@
         <w:tc>
           <w:tcPr>
             <w:tcW w:w="8647" w:type="dxa"/>
-            <w:gridSpan w:val="5"/>
+            <w:gridSpan w:val="4"/>
             <w:tcBorders>
               <w:top w:val="dotted" w:sz="4" w:space="0" w:color="auto"/>
               <w:bottom w:val="dotted" w:sz="4" w:space="0" w:color="auto"/>
@@ -2108,7 +1827,7 @@
         <w:tc>
           <w:tcPr>
             <w:tcW w:w="8647" w:type="dxa"/>
-            <w:gridSpan w:val="5"/>
+            <w:gridSpan w:val="4"/>
             <w:tcBorders>
               <w:top w:val="dotted" w:sz="4" w:space="0" w:color="auto"/>
               <w:bottom w:val="dotted" w:sz="4" w:space="0" w:color="auto"/>
@@ -2178,7 +1897,7 @@
         <w:tc>
           <w:tcPr>
             <w:tcW w:w="8647" w:type="dxa"/>
-            <w:gridSpan w:val="5"/>
+            <w:gridSpan w:val="4"/>
             <w:tcBorders>
               <w:top w:val="dotted" w:sz="4" w:space="0" w:color="auto"/>
               <w:bottom w:val="dotted" w:sz="4" w:space="0" w:color="auto"/>
@@ -2248,7 +1967,7 @@
         <w:tc>
           <w:tcPr>
             <w:tcW w:w="8647" w:type="dxa"/>
-            <w:gridSpan w:val="5"/>
+            <w:gridSpan w:val="4"/>
             <w:tcBorders>
               <w:top w:val="dotted" w:sz="4" w:space="0" w:color="auto"/>
               <w:bottom w:val="dotted" w:sz="4" w:space="0" w:color="auto"/>
@@ -2319,7 +2038,7 @@
         <w:tc>
           <w:tcPr>
             <w:tcW w:w="8647" w:type="dxa"/>
-            <w:gridSpan w:val="5"/>
+            <w:gridSpan w:val="4"/>
             <w:tcBorders>
               <w:top w:val="dotted" w:sz="4" w:space="0" w:color="auto"/>
               <w:bottom w:val="dotted" w:sz="4" w:space="0" w:color="auto"/>
@@ -2409,7 +2128,6 @@
                 <w:sz w:val="22"/>
                 <w:szCs w:val="22"/>
               </w:rPr>
-              <w:lastRenderedPageBreak/>
               <w:t>年</w:t>
             </w:r>
           </w:p>

</xml_diff>